<commit_message>
Cut word library at rank 1,500 (was 3,000); regenerate lists and library docs
Co-Authored-By: Claude Fable 5 <noreply@anthropic.com>
</commit_message>
<xml_diff>
--- a/Tongue and Groove Word Library.docx
+++ b/Tongue and Groove Word Library.docx
@@ -28,7 +28,7 @@
           <w:sz-cs w:val="24"/>
           <w:spacing w:val="0"/>
         </w:rPr>
-        <w:t xml:space="preserve">Every word and sentence in the app. The word library is built two ways at once: a CORE of the most common conversational English words (rank 1–1,000, filtered to motor-difficult patterns), plus SLP-INFORMED ADDITIONS from ranks 1,001–3,000 kept only when clinically valuable (3+ syllables, a heavy consonant cluster, or a place-switcher). Web-corpus junk — URLs, acronyms, proper nouns, brand names — is filtered out: every entry is a real spoken word that exercises the tongue. Practice decks deal 2 core words for every 1 addition, ordered short-words-first so length ramps up.</w:t>
+        <w:t xml:space="preserve">Every word and sentence in the app. The word library is built two ways at once: a CORE of the most common conversational English words (rank 1–1,000, filtered to motor-difficult patterns), plus SLP-INFORMED ADDITIONS from ranks 1,001–1,500 kept only when clinically valuable (3+ syllables, a heavy consonant cluster, or a place-switcher). Web-corpus junk — URLs, acronyms, proper nouns, brand names — is filtered out: every entry is a real spoken word that exercises the tongue. Practice decks deal 2 core words for every 1 addition, ordered short-words-first so length ramps up.</w:t>
       </w:r>
     </w:p>
     <w:p>
@@ -57,7 +57,7 @@
           <w:b/>
           <w:spacing w:val="0"/>
         </w:rPr>
-        <w:t xml:space="preserve">Totals: 390 core + 409 SLP-addition + 268 place-switcher words · 73 drill sentences · 240 scenario sentences · 12 carryover sentences</w:t>
+        <w:t xml:space="preserve">Totals: 390 core + 92 SLP-addition + 104 place-switcher words · 73 drill sentences · 240 scenario sentences · 12 carryover sentences</w:t>
       </w:r>
       <w:r>
         <w:rPr>
@@ -81,7 +81,7 @@
           <w:b/>
           <w:spacing w:val="0"/>
         </w:rPr>
-        <w:t xml:space="preserve">TH sounds (54 core + 25 SLP additions)</w:t>
+        <w:t xml:space="preserve">TH sounds (54 core + 8 SLP additions)</w:t>
       </w:r>
     </w:p>
     <w:p>
@@ -125,7 +125,7 @@
           <w:b/>
           <w:spacing w:val="0"/>
         </w:rPr>
-        <w:t xml:space="preserve">SLP additions — ranks 1,001–3,000, clinically filtered (25)</w:t>
+        <w:t xml:space="preserve">SLP additions — ranks 1,001–1,500, clinically filtered (8)</w:t>
       </w:r>
     </w:p>
     <w:p>
@@ -139,7 +139,7 @@
           <w:sz-cs w:val="24"/>
           <w:spacing w:val="0"/>
         </w:rPr>
-        <w:t xml:space="preserve">fourth, throw, strength, fifth, thinks, birth, length, thoughts, threat, depth, deaths, wealth, threw, northern, healthy, thousands, birthday, bathroom, monthly, healthcare, otherwise, therefore, therapy, authority, authorities</w:t>
+        <w:t xml:space="preserve">fourth, throw, strength, northern, healthy, otherwise, therefore, authority</w:t>
       </w:r>
     </w:p>
     <w:p>
@@ -154,7 +154,7 @@
           <w:b/>
           <w:spacing w:val="0"/>
         </w:rPr>
-        <w:t xml:space="preserve">3-consonant clusters (10 core + 30 SLP additions)</w:t>
+        <w:t xml:space="preserve">3-consonant clusters (10 core + 7 SLP additions)</w:t>
       </w:r>
     </w:p>
     <w:p>
@@ -198,7 +198,7 @@
           <w:b/>
           <w:spacing w:val="0"/>
         </w:rPr>
-        <w:t xml:space="preserve">SLP additions — ranks 1,001–3,000, clinically filtered (30)</w:t>
+        <w:t xml:space="preserve">SLP additions — ranks 1,001–1,500, clinically filtered (7)</w:t>
       </w:r>
     </w:p>
     <w:p>
@@ -212,7 +212,7 @@
           <w:sz-cs w:val="24"/>
           <w:spacing w:val="0"/>
         </w:rPr>
-        <w:t xml:space="preserve">spring, screen, throw, spread, strength, stress, streets, strike, split, strange, stream, threat, threw, structure, display, struggle, destroyed, describe, stronger, bathroom, destroy, strongly, strategy, description, industrial, ministry, structures, administration, distribution, infrastructure</w:t>
+        <w:t xml:space="preserve">spring, screen, throw, spread, strength, structure, administration</w:t>
       </w:r>
     </w:p>
     <w:p>
@@ -227,7 +227,7 @@
           <w:b/>
           <w:spacing w:val="0"/>
         </w:rPr>
-        <w:t xml:space="preserve">L-blends (31 core + 40 SLP additions)</w:t>
+        <w:t xml:space="preserve">L-blends (31 core + 12 SLP additions)</w:t>
       </w:r>
     </w:p>
     <w:p>
@@ -271,7 +271,7 @@
           <w:b/>
           <w:spacing w:val="0"/>
         </w:rPr>
-        <w:t xml:space="preserve">SLP additions — ranks 1,001–3,000, clinically filtered (40)</w:t>
+        <w:t xml:space="preserve">SLP additions — ranks 1,001–1,500, clinically filtered (12)</w:t>
       </w:r>
     </w:p>
     <w:p>
@@ -285,7 +285,7 @@
           <w:sz-cs w:val="24"/>
           <w:spacing w:val="0"/>
         </w:rPr>
-        <w:t xml:space="preserve">flight, plants, split, explain, complex, apply, employees, supply, influence, slightly, applied, conflict, display, employee, islands, supplies, strongly, includes, seriously, previously, obviously, completed, possibly, assembly, republic, explained, employment, exclusive, declared, replaced, closely, clinical, establish, established, application, republican, applications, legislation, republicans, complicated</w:t>
+        <w:t xml:space="preserve">flight, explain, complex, apply, employees, supply, includes, seriously, previously, obviously, established, application</w:t>
       </w:r>
     </w:p>
     <w:p>
@@ -300,7 +300,7 @@
           <w:b/>
           <w:spacing w:val="0"/>
         </w:rPr>
-        <w:t xml:space="preserve">R-blends (73 core + 115 SLP additions)</w:t>
+        <w:t xml:space="preserve">R-blends (73 core + 25 SLP additions)</w:t>
       </w:r>
     </w:p>
     <w:p>
@@ -344,7 +344,7 @@
           <w:b/>
           <w:spacing w:val="0"/>
         </w:rPr>
-        <w:t xml:space="preserve">SLP additions — ranks 1,001–3,000, clinically filtered (115)</w:t>
+        <w:t xml:space="preserve">SLP additions — ranks 1,001–1,500, clinically filtered (25)</w:t>
       </w:r>
     </w:p>
     <w:p>
@@ -358,7 +358,7 @@
           <w:sz-cs w:val="24"/>
           <w:spacing w:val="0"/>
         </w:rPr>
-        <w:t xml:space="preserve">spring, screen, spread, strength, stress, streets, strike, strange, stream, bright, brings, branch, contract, approach, address, congress, structure, projects, improve, background, surprise, transfer, hundred, express, girlfriend, transport, entry, angry, aircraft, friendly, struggle, destroyed, hundreds, extreme, describe, stronger, destroy, strongly, contrast, increased, professor, agreement, primary, produced, library, protection, critical, previously, african, profile, provides, criminal, presented, appreciate, prepared, strategy, description, electric, providing, industrial, proposed, increasing, surprised, appropriate, properties, approved, properly, ministry, improved, controlled, represent, depression, frequently, expression, practices, democrats, attractive, expressed, principal, protected, approval, tradition, celebrate, criticism, promised, practical, represents, structures, impressive, proposal, increases, processes, processing, transition, secretary, administration, traditional, extremely, democratic, introduced, approximately, distribution, incredible, representative, transportation, electronic, represented, introduction, presidential, representatives, democracy, improvement, primarily, immigration, infrastructure</w:t>
+        <w:t xml:space="preserve">spring, screen, spread, strength, contract, approach, address, congress, structure, projects, increased, professor, agreement, primary, produced, library, protection, critical, previously, african, profile, provides, secretary, administration, traditional</w:t>
       </w:r>
     </w:p>
     <w:p>
@@ -373,7 +373,7 @@
           <w:b/>
           <w:spacing w:val="0"/>
         </w:rPr>
-        <w:t xml:space="preserve">S-blends (36 core + 30 SLP additions)</w:t>
+        <w:t xml:space="preserve">S-blends (36 core + 8 SLP additions)</w:t>
       </w:r>
     </w:p>
     <w:p>
@@ -417,7 +417,7 @@
           <w:b/>
           <w:spacing w:val="0"/>
         </w:rPr>
-        <w:t xml:space="preserve">SLP additions — ranks 1,001–3,000, clinically filtered (30)</w:t>
+        <w:t xml:space="preserve">SLP additions — ranks 1,001–1,500, clinically filtered (8)</w:t>
       </w:r>
     </w:p>
     <w:p>
@@ -431,7 +431,7 @@
           <w:sz-cs w:val="24"/>
           <w:spacing w:val="0"/>
         </w:rPr>
-        <w:t xml:space="preserve">sports, spring, screen, starts, spread, strength, skills, stress, streets, strike, split, strange, stream, stands, switch, scheme, structure, standards, struggle, stronger, scientists, strongly, statement, strategy, schedule, scientific, statistics, statements, structures, specifically</w:t>
+        <w:t xml:space="preserve">sports, spring, screen, starts, spread, strength, structure, statement</w:t>
       </w:r>
     </w:p>
     <w:p>
@@ -446,7 +446,7 @@
           <w:b/>
           <w:spacing w:val="0"/>
         </w:rPr>
-        <w:t xml:space="preserve">Final clusters (186 core + 169 SLP additions)</w:t>
+        <w:t xml:space="preserve">Final clusters (186 core + 32 SLP additions)</w:t>
       </w:r>
     </w:p>
     <w:p>
@@ -490,7 +490,7 @@
           <w:b/>
           <w:spacing w:val="0"/>
         </w:rPr>
-        <w:t xml:space="preserve">SLP additions — ranks 1,001–3,000, clinically filtered (169)</w:t>
+        <w:t xml:space="preserve">SLP additions — ranks 1,001–1,500, clinically filtered (32)</w:t>
       </w:r>
     </w:p>
     <w:p>
@@ -504,7 +504,7 @@
           <w:sz-cs w:val="24"/>
           <w:spacing w:val="0"/>
         </w:rPr>
-        <w:t xml:space="preserve">sounds, costs, sports, worst, calls, songs, starts, arms, tells, thinks, skills, cards, turns, cells, ends, thoughts, funds, helps, forms, facts, links, plants, signs, arts, banks, tests, streets, posts, acts, films, lights, falls, walls, brings, finds, stands, talks, birds, fields, holds, pounds, balls, bills, kinds, yards, eggs, marks, pants, nights, courts, hills, contract, patients, records, reports, effects, comments, seconds, attempt, northern, projects, standards, background, efforts, thousands, accounts, awards, feelings, buildings, attacks, girlfriend, transport, artists, aircraft, conflict, moments, hundreds, answers, returns, adults, concerns, partners, agents, constant, depends, experts, objects, aspects, attempts, functions, islands, scientists, suggests, exists, meetings, payments, symptoms, contrast, statement, agreement, characters, equipment, officers, politics, animals, benefits, investment, customers, materials, parliament, excellent, assistant, citizens, decisions, accident, elements, officials, restaurant, relations, elections, interests, apartment, argument, documents, residents, positions, recommend, relevant, statistics, represent, permanent, employment, tournament, democrats, incident, statements, document, solutions, appointment, criticism, settlement, visitors, consistent, represents, household, managers, situations, assessment, element, locations, supporters, independent, environment, operations, americans, individuals, relationships, organizations, applications, requirements, entertainment, communications, institutions, politicians, retirement, equivalent, regulations, republicans, improvement</w:t>
+        <w:t xml:space="preserve">sounds, costs, sports, worst, calls, songs, starts, arms, contract, patients, records, reports, effects, comments, seconds, attempt, northern, projects, statement, agreement, characters, equipment, officers, politics, animals, benefits, investment, independent, environment, operations, americans, individuals</w:t>
       </w:r>
     </w:p>
     <w:p>
@@ -519,7 +519,7 @@
           <w:b/>
           <w:spacing w:val="0"/>
         </w:rPr>
-        <w:t xml:space="preserve">Place-switchers — hidden category (268 words)</w:t>
+        <w:t xml:space="preserve">Place-switchers — hidden category (104 words)</w:t>
       </w:r>
     </w:p>
     <w:p>
@@ -548,7 +548,7 @@
           <w:sz-cs w:val="24"/>
           <w:spacing w:val="0"/>
         </w:rPr>
-        <w:t xml:space="preserve">something, government, including, following, probably, possible, services, experience, department, beautiful, medical, performance, received, themselves, production, whatever, character, property, involved, financial, difficult, followed, specific, provided, tomorrow, conference, difference, beginning, described, construction, manager, collection, expected, physical, successful, commercial, multiple, professor, effective, agreement, characters, primary, politics, produced, powerful, protection, wonderful, benefits, investment, becomes, critical, previously, african, benefit, profile, becoming, provides, negative, advantage, customers, marketing, possibly, connection, managed, believed, concerned, criminal, develop, technical, appreciate, forever, parliament, prepared, reference, description, medicine, electric, festival, providing, advanced, policies, proposed, supporting, domestic, expensive, connected, exercise, increasing, performed, appropriate, confirmed, regarding, scientific, apartment, confidence, properties, approved, argument, corporate, documents, properly, collected, coverage, remaining, whenever, allowing, customer, improved, perfectly, recommend, newspaper, republic, careful, devices, pacific, receiving, typical, conducted, chemical, permanent, basketball, consumer, depending, employment, frequently, performing, perspective, practices, replaced, agencies, baseball, championship, democrats, messages, reporting, attractive, suffering, principal, clinical, musical, protected, purposes, recording, techniques, valuable, approval, convention, document, neighborhood, permission, appointment, celebrate, challenges, criticism, formation, promised, involving, meanwhile, percentage, practical, confused, managers, proposal, purchased, atmosphere, processes, processing, qualified, buttercup, cucumber, gymnasium, cinnamon, spaghetti, umbrella, banana, potato, tomato, pajamas, american, information, development, political, available, sometimes, especially, management, economic, technology, professional, particular, significant, particularly, developed, activities, responsible, environment, activity, application, everybody, americans, engineering, extremely, impossible, conversation, investigation, responsibility, discovered, democratic, emergency, capacity, environmental, intelligence, republican, communication, comfortable, developing, everywhere, specifically, applications, approximately, requirements, basically, experienced, incredible, typically, conservative, circumstances, communications, corporation, independence, possibility, recovery, academic, category, competitive, representative, manufacturing, electronic, experiences, advertising, politicians, significantly, automatically, differences, representatives, democracy, recommended, republicans, contemporary, effectively, improvement, primarily, complicated, consequences, carefully, infrastructure, helicopter, calculator, refrigerator, thermometer, caterpillar, watermelon, motorcycle, supermarket, aluminum, magnificent, temperature, vegetable</w:t>
+        <w:t xml:space="preserve">something, government, including, following, probably, possible, services, experience, department, beautiful, medical, performance, received, themselves, production, whatever, character, property, involved, financial, difficult, followed, specific, provided, tomorrow, conference, difference, beginning, described, construction, manager, collection, expected, physical, successful, commercial, multiple, professor, effective, agreement, characters, primary, politics, produced, powerful, protection, wonderful, benefits, investment, becomes, critical, previously, african, benefit, profile, becoming, provides, buttercup, basketball, cucumber, gymnasium, cinnamon, spaghetti, umbrella, banana, potato, tomato, pajamas, american, information, development, political, available, sometimes, especially, management, economic, technology, professional, particular, significant, particularly, developed, activities, responsible, environment, activity, application, everybody, americans, engineering, helicopter, calculator, refrigerator, thermometer, caterpillar, watermelon, motorcycle, supermarket, aluminum, magnificent, comfortable, temperature, vegetable</w:t>
       </w:r>
     </w:p>
     <w:p>

</xml_diff>

<commit_message>
Gate 3: no single-syllable words in the pool, period
CB: easy single-syllable words stay out even when common (street, bring,
think, friend, great, free...) — they don't trip anyone up. Pool now 276
words, all 2+ syllables (tiers 101/82/83/10). 263 single-syllable deletions
listed in vocab-audit.md. Assessment example words re-picked from the pool.
Word Library .md/.docx regenerated.

Co-Authored-By: Claude Fable 5 <noreply@anthropic.com>
</commit_message>
<xml_diff>
--- a/Tongue and Groove Word Library.docx
+++ b/Tongue and Groove Word Library.docx
@@ -57,7 +57,7 @@
           <w:b/>
           <w:spacing w:val="0"/>
         </w:rPr>
-        <w:t xml:space="preserve">Totals: 350 pool words (tiers 2–5) + 104 place-switchers · 73 drill sentences · 272 scenario sentences</w:t>
+        <w:t xml:space="preserve">Totals: 276 pool words (tiers 2–5) + 104 place-switchers · 73 drill sentences · 272 scenario sentences</w:t>
       </w:r>
       <w:r>
         <w:rPr>
@@ -81,7 +81,7 @@
           <w:b/>
           <w:spacing w:val="0"/>
         </w:rPr>
-        <w:t xml:space="preserve">TH sounds (37)</w:t>
+        <w:t xml:space="preserve">TH sounds (20)</w:t>
       </w:r>
     </w:p>
     <w:p>
@@ -96,7 +96,7 @@
           <w:b/>
           <w:spacing w:val="0"/>
         </w:rPr>
-        <w:t xml:space="preserve">Tier 2 (24)</w:t>
+        <w:t xml:space="preserve">Tier 2 (11)</w:t>
       </w:r>
     </w:p>
     <w:p>
@@ -110,7 +110,7 @@
           <w:sz-cs w:val="24"/>
           <w:spacing w:val="0"/>
         </w:rPr>
-        <w:t xml:space="preserve">think, through, three, thing, nothing, thank, together, health, months, month, brother, truth, throughout, author, theory, therefore, weather, northern, southern, fourth, mouth, throw, faith, method</w:t>
+        <w:t xml:space="preserve">nothing, together, brother, throughout, author, theory, therefore, weather, northern, southern, method</w:t>
       </w:r>
     </w:p>
     <w:p>
@@ -125,7 +125,7 @@
           <w:b/>
           <w:spacing w:val="0"/>
         </w:rPr>
-        <w:t xml:space="preserve">Tier 3 (12)</w:t>
+        <w:t xml:space="preserve">Tier 3 (8)</w:t>
       </w:r>
     </w:p>
     <w:p>
@@ -139,7 +139,7 @@
           <w:sz-cs w:val="24"/>
           <w:spacing w:val="0"/>
         </w:rPr>
-        <w:t xml:space="preserve">something, things, anything, everything, thanks, thinking, themselves, growth, otherwise, authority, healthy, strength</w:t>
+        <w:t xml:space="preserve">something, anything, everything, thinking, themselves, otherwise, authority, healthy</w:t>
       </w:r>
     </w:p>
     <w:p>
@@ -183,7 +183,7 @@
           <w:b/>
           <w:spacing w:val="0"/>
         </w:rPr>
-        <w:t xml:space="preserve">3-consonant clusters (26)</w:t>
+        <w:t xml:space="preserve">3-consonant clusters (16)</w:t>
       </w:r>
     </w:p>
     <w:p>
@@ -198,7 +198,7 @@
           <w:b/>
           <w:spacing w:val="0"/>
         </w:rPr>
-        <w:t xml:space="preserve">Tier 2 (8)</w:t>
+        <w:t xml:space="preserve">Tier 2 (1)</w:t>
       </w:r>
     </w:p>
     <w:p>
@@ -212,7 +212,7 @@
           <w:sz-cs w:val="24"/>
           <w:spacing w:val="0"/>
         </w:rPr>
-        <w:t xml:space="preserve">through, three, street, straight, throughout, screen, throw, spread</w:t>
+        <w:t xml:space="preserve">throughout</w:t>
       </w:r>
     </w:p>
     <w:p>
@@ -227,7 +227,7 @@
           <w:b/>
           <w:spacing w:val="0"/>
         </w:rPr>
-        <w:t xml:space="preserve">Tier 3 (5)</w:t>
+        <w:t xml:space="preserve">Tier 3 (2)</w:t>
       </w:r>
     </w:p>
     <w:p>
@@ -241,7 +241,7 @@
           <w:sz-cs w:val="24"/>
           <w:spacing w:val="0"/>
         </w:rPr>
-        <w:t xml:space="preserve">strong, district, described, spring, strength</w:t>
+        <w:t xml:space="preserve">district, described</w:t>
       </w:r>
     </w:p>
     <w:p>
@@ -314,7 +314,7 @@
           <w:b/>
           <w:spacing w:val="0"/>
         </w:rPr>
-        <w:t xml:space="preserve">L-blends (44)</w:t>
+        <w:t xml:space="preserve">L-blends (40)</w:t>
       </w:r>
     </w:p>
     <w:p>
@@ -329,7 +329,7 @@
           <w:b/>
           <w:spacing w:val="0"/>
         </w:rPr>
-        <w:t xml:space="preserve">Tier 2 (10)</w:t>
+        <w:t xml:space="preserve">Tier 2 (6)</w:t>
       </w:r>
     </w:p>
     <w:p>
@@ -343,7 +343,7 @@
           <w:sz-cs w:val="24"/>
           <w:spacing w:val="0"/>
         </w:rPr>
-        <w:t xml:space="preserve">problem, playing, published, plans, global, clearly, closed, plant, claims, placed</w:t>
+        <w:t xml:space="preserve">problem, published, global, clearly, closed, placed</w:t>
       </w:r>
     </w:p>
     <w:p>
@@ -445,7 +445,7 @@
           <w:b/>
           <w:spacing w:val="0"/>
         </w:rPr>
-        <w:t xml:space="preserve">R-blends (129)</w:t>
+        <w:t xml:space="preserve">R-blends (107)</w:t>
       </w:r>
     </w:p>
     <w:p>
@@ -460,7 +460,7 @@
           <w:b/>
           <w:spacing w:val="0"/>
         </w:rPr>
-        <w:t xml:space="preserve">Tier 2 (43)</w:t>
+        <w:t xml:space="preserve">Tier 2 (27)</w:t>
       </w:r>
     </w:p>
     <w:p>
@@ -474,7 +474,7 @@
           <w:sz-cs w:val="24"/>
           <w:spacing w:val="0"/>
         </w:rPr>
-        <w:t xml:space="preserve">trying, problem, friend, front, street, bring, program, project, present, training, ground, trust, groups, brother, property, practice, professional, truth, straight, provided, brown, agree, degree, secret, grand, drink, greater, professor, broken, prices, primary, produced, truly, freedom, screen, traffic, agreed, brand, critical, profile, spread, prison, provides</w:t>
+        <w:t xml:space="preserve">problem, program, project, present, training, brother, property, practice, professional, provided, agree, degree, secret, greater, professor, broken, prices, primary, produced, truly, freedom, traffic, agreed, critical, profile, prison, provides</w:t>
       </w:r>
     </w:p>
     <w:p>
@@ -489,7 +489,7 @@
           <w:b/>
           <w:spacing w:val="0"/>
         </w:rPr>
-        <w:t xml:space="preserve">Tier 3 (36)</w:t>
+        <w:t xml:space="preserve">Tier 3 (30)</w:t>
       </w:r>
     </w:p>
     <w:p>
@@ -503,7 +503,7 @@
           <w:sz-cs w:val="24"/>
           <w:spacing w:val="0"/>
         </w:rPr>
-        <w:t xml:space="preserve">country, children, president, friends, control, probably, strong, problems, production, countries, central, french, increase, district, products, growth, treatment, described, extra, product, secretary, growing, approach, protect, spring, address, congress, driving, programs, agreement, library, protection, traditional, previously, african, strength</w:t>
+        <w:t xml:space="preserve">country, children, president, control, probably, problems, production, countries, central, increase, district, products, treatment, described, extra, product, secretary, growing, approach, protect, address, congress, driving, programs, agreement, library, protection, traditional, previously, african</w:t>
       </w:r>
     </w:p>
     <w:p>
@@ -576,7 +576,7 @@
           <w:b/>
           <w:spacing w:val="0"/>
         </w:rPr>
-        <w:t xml:space="preserve">S-blends (38)</w:t>
+        <w:t xml:space="preserve">S-blends (23)</w:t>
       </w:r>
     </w:p>
     <w:p>
@@ -591,7 +591,7 @@
           <w:b/>
           <w:spacing w:val="0"/>
         </w:rPr>
-        <w:t xml:space="preserve">Tier 2 (22)</w:t>
+        <w:t xml:space="preserve">Tier 2 (11)</w:t>
       </w:r>
     </w:p>
     <w:p>
@@ -605,7 +605,7 @@
           <w:sz-cs w:val="24"/>
           <w:spacing w:val="0"/>
         </w:rPr>
-        <w:t xml:space="preserve">school, street, stand, science, starting, straight, specific, standard, spent, student, spend, stories, sports, stupid, status, screen, species, stopped, scale, starts, spread, smaller</w:t>
+        <w:t xml:space="preserve">starting, specific, standard, student, stories, stupid, status, species, stopped, scale, smaller</w:t>
       </w:r>
     </w:p>
     <w:p>
@@ -620,7 +620,7 @@
           <w:b/>
           <w:spacing w:val="0"/>
         </w:rPr>
-        <w:t xml:space="preserve">Tier 3 (8)</w:t>
+        <w:t xml:space="preserve">Tier 3 (4)</w:t>
       </w:r>
     </w:p>
     <w:p>
@@ -634,7 +634,7 @@
           <w:sz-cs w:val="24"/>
           <w:spacing w:val="0"/>
         </w:rPr>
-        <w:t xml:space="preserve">students, strong, schools, statement, spring, speaking, standing, strength</w:t>
+        <w:t xml:space="preserve">students, statement, speaking, standing</w:t>
       </w:r>
     </w:p>
     <w:p>
@@ -678,7 +678,7 @@
           <w:b/>
           <w:spacing w:val="0"/>
         </w:rPr>
-        <w:t xml:space="preserve">Final clusters (180)</w:t>
+        <w:t xml:space="preserve">Final clusters (132)</w:t>
       </w:r>
     </w:p>
     <w:p>
@@ -693,7 +693,7 @@
           <w:b/>
           <w:spacing w:val="0"/>
         </w:rPr>
-        <w:t xml:space="preserve">Tier 2 (94)</w:t>
+        <w:t xml:space="preserve">Tier 2 (54)</w:t>
       </w:r>
     </w:p>
     <w:p>
@@ -707,7 +707,7 @@
           <w:sz-cs w:val="24"/>
           <w:spacing w:val="0"/>
         </w:rPr>
-        <w:t xml:space="preserve">think, different, thank, almost, friend, front, himself, wants, points, project, account, perfect, rights, event, present, result, hands, ground, questions, stand, amount, trust, groups, itself, perhaps, difficult, systems, towards, percent, recent, respect, standard, effect, except, network, spent, student, expect, plans, western, content, husband, contact, levels, movement, sold, spend, teams, happens, goals, meant, sports, biggest, reasons, weekend, worst, band, latest, details, direct, grand, drink, feels, largest, records, reports, plant, comment, lots, coast, officers, claims, highest, accept, northern, demand, runs, southern, wind, brand, cent, count, starts, arms, fund, agent, adult, artist, nations, remains, wild, camp, cast, correct</w:t>
+        <w:t xml:space="preserve">different, almost, himself, project, account, perfect, event, present, result, questions, amount, itself, perhaps, difficult, systems, towards, percent, recent, respect, standard, effect, except, network, student, expect, western, content, husband, contact, levels, movement, happens, biggest, reasons, weekend, latest, details, direct, largest, records, reports, comment, officers, highest, accept, northern, demand, southern, agent, adult, artist, nations, remains, correct</w:t>
       </w:r>
     </w:p>
     <w:p>
@@ -722,7 +722,7 @@
           <w:b/>
           <w:spacing w:val="0"/>
         </w:rPr>
-        <w:t xml:space="preserve">Tier 3 (46)</w:t>
+        <w:t xml:space="preserve">Tier 3 (38)</w:t>
       </w:r>
     </w:p>
     <w:p>
@@ -736,7 +736,7 @@
           <w:sz-cs w:val="24"/>
           <w:spacing w:val="0"/>
         </w:rPr>
-        <w:t xml:space="preserve">things, government, president, important, friends, thanks, understand, development, students, department, results, parents, problems, interest, management, events, schools, district, products, treatment, conditions, significant, sounds, statement, costs, subject, product, impact, protect, calls, patients, programs, effects, agreement, characters, equipment, comments, operations, politics, seconds, attempt, animals, benefits, songs, americans, actions</w:t>
+        <w:t xml:space="preserve">government, president, important, understand, development, students, department, results, parents, problems, interest, management, events, district, products, treatment, conditions, significant, statement, subject, product, impact, protect, patients, programs, effects, agreement, characters, equipment, comments, operations, politics, seconds, attempt, animals, benefits, americans, actions</w:t>
       </w:r>
     </w:p>
     <w:p>

</xml_diff>

<commit_message>
Fill thin scenario sentence banks: 70 new ladder-verified sentences — Work, Phone, Family, Shopping all session-ready (11+ at every rung); In-progress badges retire
Co-Authored-By: Claude Fable 5 <noreply@anthropic.com>
</commit_message>
<xml_diff>
--- a/Tongue and Groove Word Library.docx
+++ b/Tongue and Groove Word Library.docx
@@ -57,7 +57,7 @@
           <w:b/>
           <w:spacing w:val="0"/>
         </w:rPr>
-        <w:t xml:space="preserve">Totals: 276 pool words (tiers 2–5) + 104 place-switchers · 73 drill sentences · 272 scenario sentences</w:t>
+        <w:t xml:space="preserve">Totals: 276 pool words (tiers 2–5) + 104 place-switchers · 73 drill sentences · 342 scenario sentences</w:t>
       </w:r>
       <w:r>
         <w:rPr>
@@ -7945,7 +7945,7 @@
           <w:b/>
           <w:spacing w:val="0"/>
         </w:rPr>
-        <w:t xml:space="preserve">Work &amp; business (40 words · 30 sentences)</w:t>
+        <w:t xml:space="preserve">Work &amp; business (40 words · 47 sentences)</w:t>
       </w:r>
     </w:p>
     <w:p>
@@ -8774,6 +8774,448 @@
           <w:spacing w:val="0"/>
         </w:rPr>
         <w:t xml:space="preserve">Let's follow up by email after the call.</w:t>
+      </w:r>
+    </w:p>
+    <w:p>
+      <w:pPr>
+        <w:ind w:left="720" w:first-line="-720"/>
+      </w:pPr>
+      <w:r>
+        <w:rPr>
+          <w:rFonts w:ascii="Helvetica" w:hAnsi="Helvetica" w:cs="Helvetica"/>
+          <w:sz w:val="24"/>
+          <w:sz-cs w:val="24"/>
+        </w:rPr>
+        <w:t xml:space="preserve"/>
+        <w:tab/>
+        <w:t xml:space="preserve">•</w:t>
+        <w:tab/>
+        <w:t xml:space="preserve"/>
+      </w:r>
+      <w:r>
+        <w:rPr>
+          <w:rFonts w:ascii="Helvetica" w:hAnsi="Helvetica" w:cs="Helvetica"/>
+          <w:sz w:val="24"/>
+          <w:sz-cs w:val="24"/>
+          <w:spacing w:val="0"/>
+        </w:rPr>
+        <w:t xml:space="preserve">Our client asked for a cleaner layout. (lb ×2)</w:t>
+      </w:r>
+    </w:p>
+    <w:p>
+      <w:pPr>
+        <w:ind w:left="720" w:first-line="-720"/>
+      </w:pPr>
+      <w:r>
+        <w:rPr>
+          <w:rFonts w:ascii="Helvetica" w:hAnsi="Helvetica" w:cs="Helvetica"/>
+          <w:sz w:val="24"/>
+          <w:sz-cs w:val="24"/>
+        </w:rPr>
+        <w:t xml:space="preserve"/>
+        <w:tab/>
+        <w:t xml:space="preserve">•</w:t>
+        <w:tab/>
+        <w:t xml:space="preserve"/>
+      </w:r>
+      <w:r>
+        <w:rPr>
+          <w:rFonts w:ascii="Helvetica" w:hAnsi="Helvetica" w:cs="Helvetica"/>
+          <w:sz w:val="24"/>
+          <w:sz-cs w:val="24"/>
+          <w:spacing w:val="0"/>
+        </w:rPr>
+        <w:t xml:space="preserve">My manager moved the monthly meeting to Thursday. (th ×2)</w:t>
+      </w:r>
+    </w:p>
+    <w:p>
+      <w:pPr>
+        <w:ind w:left="720" w:first-line="-720"/>
+      </w:pPr>
+      <w:r>
+        <w:rPr>
+          <w:rFonts w:ascii="Helvetica" w:hAnsi="Helvetica" w:cs="Helvetica"/>
+          <w:sz w:val="24"/>
+          <w:sz-cs w:val="24"/>
+        </w:rPr>
+        <w:t xml:space="preserve"/>
+        <w:tab/>
+        <w:t xml:space="preserve">•</w:t>
+        <w:tab/>
+        <w:t xml:space="preserve"/>
+      </w:r>
+      <w:r>
+        <w:rPr>
+          <w:rFonts w:ascii="Helvetica" w:hAnsi="Helvetica" w:cs="Helvetica"/>
+          <w:sz w:val="24"/>
+          <w:sz-cs w:val="24"/>
+          <w:spacing w:val="0"/>
+        </w:rPr>
+        <w:t xml:space="preserve">I stapled the summary to the spending report. (sb ×2)</w:t>
+      </w:r>
+    </w:p>
+    <w:p>
+      <w:pPr>
+        <w:ind w:left="720" w:first-line="-720"/>
+      </w:pPr>
+      <w:r>
+        <w:rPr>
+          <w:rFonts w:ascii="Helvetica" w:hAnsi="Helvetica" w:cs="Helvetica"/>
+          <w:sz w:val="24"/>
+          <w:sz-cs w:val="24"/>
+        </w:rPr>
+        <w:t xml:space="preserve"/>
+        <w:tab/>
+        <w:t xml:space="preserve">•</w:t>
+        <w:tab/>
+        <w:t xml:space="preserve"/>
+      </w:r>
+      <w:r>
+        <w:rPr>
+          <w:rFonts w:ascii="Helvetica" w:hAnsi="Helvetica" w:cs="Helvetica"/>
+          <w:sz w:val="24"/>
+          <w:sz-cs w:val="24"/>
+          <w:spacing w:val="0"/>
+        </w:rPr>
+        <w:t xml:space="preserve">My printer broke during the demo. (rb ×2)</w:t>
+      </w:r>
+    </w:p>
+    <w:p>
+      <w:pPr>
+        <w:ind w:left="720" w:first-line="-720"/>
+      </w:pPr>
+      <w:r>
+        <w:rPr>
+          <w:rFonts w:ascii="Helvetica" w:hAnsi="Helvetica" w:cs="Helvetica"/>
+          <w:sz w:val="24"/>
+          <w:sz-cs w:val="24"/>
+        </w:rPr>
+        <w:t xml:space="preserve"/>
+        <w:tab/>
+        <w:t xml:space="preserve">•</w:t>
+        <w:tab/>
+        <w:t xml:space="preserve"/>
+      </w:r>
+      <w:r>
+        <w:rPr>
+          <w:rFonts w:ascii="Helvetica" w:hAnsi="Helvetica" w:cs="Helvetica"/>
+          <w:sz w:val="24"/>
+          <w:sz-cs w:val="24"/>
+          <w:spacing w:val="0"/>
+        </w:rPr>
+        <w:t xml:space="preserve">Our strategy needs a stronger pitch. (tri ×2)</w:t>
+      </w:r>
+    </w:p>
+    <w:p>
+      <w:pPr>
+        <w:ind w:left="720" w:first-line="-720"/>
+      </w:pPr>
+      <w:r>
+        <w:rPr>
+          <w:rFonts w:ascii="Helvetica" w:hAnsi="Helvetica" w:cs="Helvetica"/>
+          <w:sz w:val="24"/>
+          <w:sz-cs w:val="24"/>
+        </w:rPr>
+        <w:t xml:space="preserve"/>
+        <w:tab/>
+        <w:t xml:space="preserve">•</w:t>
+        <w:tab/>
+        <w:t xml:space="preserve"/>
+      </w:r>
+      <w:r>
+        <w:rPr>
+          <w:rFonts w:ascii="Helvetica" w:hAnsi="Helvetica" w:cs="Helvetica"/>
+          <w:sz w:val="24"/>
+          <w:sz-cs w:val="24"/>
+          <w:spacing w:val="0"/>
+        </w:rPr>
+        <w:t xml:space="preserve">The staff meeting starts at noon sharp. (sb ×2)</w:t>
+      </w:r>
+    </w:p>
+    <w:p>
+      <w:pPr>
+        <w:ind w:left="720" w:first-line="-720"/>
+      </w:pPr>
+      <w:r>
+        <w:rPr>
+          <w:rFonts w:ascii="Helvetica" w:hAnsi="Helvetica" w:cs="Helvetica"/>
+          <w:sz w:val="24"/>
+          <w:sz-cs w:val="24"/>
+        </w:rPr>
+        <w:t xml:space="preserve"/>
+        <w:tab/>
+        <w:t xml:space="preserve">•</w:t>
+        <w:tab/>
+        <w:t xml:space="preserve"/>
+      </w:r>
+      <w:r>
+        <w:rPr>
+          <w:rFonts w:ascii="Helvetica" w:hAnsi="Helvetica" w:cs="Helvetica"/>
+          <w:sz w:val="24"/>
+          <w:sz-cs w:val="24"/>
+          <w:spacing w:val="0"/>
+        </w:rPr>
+        <w:t xml:space="preserve">The training program impressed our new recruits. (rb ×5)</w:t>
+      </w:r>
+    </w:p>
+    <w:p>
+      <w:pPr>
+        <w:ind w:left="720" w:first-line="-720"/>
+      </w:pPr>
+      <w:r>
+        <w:rPr>
+          <w:rFonts w:ascii="Helvetica" w:hAnsi="Helvetica" w:cs="Helvetica"/>
+          <w:sz w:val="24"/>
+          <w:sz-cs w:val="24"/>
+        </w:rPr>
+        <w:t xml:space="preserve"/>
+        <w:tab/>
+        <w:t xml:space="preserve">•</w:t>
+        <w:tab/>
+        <w:t xml:space="preserve"/>
+      </w:r>
+      <w:r>
+        <w:rPr>
+          <w:rFonts w:ascii="Helvetica" w:hAnsi="Helvetica" w:cs="Helvetica"/>
+          <w:sz w:val="24"/>
+          <w:sz-cs w:val="24"/>
+          <w:spacing w:val="0"/>
+        </w:rPr>
+        <w:t xml:space="preserve">The spreadsheet describes our strategy. (tri ×3)</w:t>
+      </w:r>
+    </w:p>
+    <w:p>
+      <w:pPr>
+        <w:ind w:left="720" w:first-line="-720"/>
+      </w:pPr>
+      <w:r>
+        <w:rPr>
+          <w:rFonts w:ascii="Helvetica" w:hAnsi="Helvetica" w:cs="Helvetica"/>
+          <w:sz w:val="24"/>
+          <w:sz-cs w:val="24"/>
+        </w:rPr>
+        <w:t xml:space="preserve"/>
+        <w:tab/>
+        <w:t xml:space="preserve">•</w:t>
+        <w:tab/>
+        <w:t xml:space="preserve"/>
+      </w:r>
+      <w:r>
+        <w:rPr>
+          <w:rFonts w:ascii="Helvetica" w:hAnsi="Helvetica" w:cs="Helvetica"/>
+          <w:sz w:val="24"/>
+          <w:sz-cs w:val="24"/>
+          <w:spacing w:val="0"/>
+        </w:rPr>
+        <w:t xml:space="preserve">Our profit projections improved every quarter. (rb ×3)</w:t>
+      </w:r>
+    </w:p>
+    <w:p>
+      <w:pPr>
+        <w:ind w:left="720" w:first-line="-720"/>
+      </w:pPr>
+      <w:r>
+        <w:rPr>
+          <w:rFonts w:ascii="Helvetica" w:hAnsi="Helvetica" w:cs="Helvetica"/>
+          <w:sz w:val="24"/>
+          <w:sz-cs w:val="24"/>
+        </w:rPr>
+        <w:t xml:space="preserve"/>
+        <w:tab/>
+        <w:t xml:space="preserve">•</w:t>
+        <w:tab/>
+        <w:t xml:space="preserve"/>
+      </w:r>
+      <w:r>
+        <w:rPr>
+          <w:rFonts w:ascii="Helvetica" w:hAnsi="Helvetica" w:cs="Helvetica"/>
+          <w:sz w:val="24"/>
+          <w:sz-cs w:val="24"/>
+          <w:spacing w:val="0"/>
+        </w:rPr>
+        <w:t xml:space="preserve">Practice your presentation before the progress review. (rb ×4)</w:t>
+      </w:r>
+    </w:p>
+    <w:p>
+      <w:pPr>
+        <w:ind w:left="720" w:first-line="-720"/>
+      </w:pPr>
+      <w:r>
+        <w:rPr>
+          <w:rFonts w:ascii="Helvetica" w:hAnsi="Helvetica" w:cs="Helvetica"/>
+          <w:sz w:val="24"/>
+          <w:sz-cs w:val="24"/>
+        </w:rPr>
+        <w:t xml:space="preserve"/>
+        <w:tab/>
+        <w:t xml:space="preserve">•</w:t>
+        <w:tab/>
+        <w:t xml:space="preserve"/>
+      </w:r>
+      <w:r>
+        <w:rPr>
+          <w:rFonts w:ascii="Helvetica" w:hAnsi="Helvetica" w:cs="Helvetica"/>
+          <w:sz w:val="24"/>
+          <w:sz-cs w:val="24"/>
+          <w:spacing w:val="0"/>
+        </w:rPr>
+        <w:t xml:space="preserve">I think this month's meeting is on Thursday. (th ×3)</w:t>
+      </w:r>
+    </w:p>
+    <w:p>
+      <w:pPr>
+        <w:ind w:left="720" w:first-line="-720"/>
+      </w:pPr>
+      <w:r>
+        <w:rPr>
+          <w:rFonts w:ascii="Helvetica" w:hAnsi="Helvetica" w:cs="Helvetica"/>
+          <w:sz w:val="24"/>
+          <w:sz-cs w:val="24"/>
+        </w:rPr>
+        <w:t xml:space="preserve"/>
+        <w:tab/>
+        <w:t xml:space="preserve">•</w:t>
+        <w:tab/>
+        <w:t xml:space="preserve"/>
+      </w:r>
+      <w:r>
+        <w:rPr>
+          <w:rFonts w:ascii="Helvetica" w:hAnsi="Helvetica" w:cs="Helvetica"/>
+          <w:sz w:val="24"/>
+          <w:sz-cs w:val="24"/>
+          <w:spacing w:val="0"/>
+        </w:rPr>
+        <w:t xml:space="preserve">Thank the team for another smooth month. (th ×4)</w:t>
+      </w:r>
+    </w:p>
+    <w:p>
+      <w:pPr>
+        <w:ind w:left="720" w:first-line="-720"/>
+      </w:pPr>
+      <w:r>
+        <w:rPr>
+          <w:rFonts w:ascii="Helvetica" w:hAnsi="Helvetica" w:cs="Helvetica"/>
+          <w:sz w:val="24"/>
+          <w:sz-cs w:val="24"/>
+        </w:rPr>
+        <w:t xml:space="preserve"/>
+        <w:tab/>
+        <w:t xml:space="preserve">•</w:t>
+        <w:tab/>
+        <w:t xml:space="preserve"/>
+      </w:r>
+      <w:r>
+        <w:rPr>
+          <w:rFonts w:ascii="Helvetica" w:hAnsi="Helvetica" w:cs="Helvetica"/>
+          <w:sz w:val="24"/>
+          <w:sz-cs w:val="24"/>
+          <w:spacing w:val="0"/>
+        </w:rPr>
+        <w:t xml:space="preserve">My schedule stays steady all season. (sb ×3)</w:t>
+      </w:r>
+    </w:p>
+    <w:p>
+      <w:pPr>
+        <w:ind w:left="720" w:first-line="-720"/>
+      </w:pPr>
+      <w:r>
+        <w:rPr>
+          <w:rFonts w:ascii="Helvetica" w:hAnsi="Helvetica" w:cs="Helvetica"/>
+          <w:sz w:val="24"/>
+          <w:sz-cs w:val="24"/>
+        </w:rPr>
+        <w:t xml:space="preserve"/>
+        <w:tab/>
+        <w:t xml:space="preserve">•</w:t>
+        <w:tab/>
+        <w:t xml:space="preserve"/>
+      </w:r>
+      <w:r>
+        <w:rPr>
+          <w:rFonts w:ascii="Helvetica" w:hAnsi="Helvetica" w:cs="Helvetica"/>
+          <w:sz w:val="24"/>
+          <w:sz-cs w:val="24"/>
+          <w:spacing w:val="0"/>
+        </w:rPr>
+        <w:t xml:space="preserve">The client claimed the plan was clear. (lb ×4)</w:t>
+      </w:r>
+    </w:p>
+    <w:p>
+      <w:pPr>
+        <w:ind w:left="720" w:first-line="-720"/>
+      </w:pPr>
+      <w:r>
+        <w:rPr>
+          <w:rFonts w:ascii="Helvetica" w:hAnsi="Helvetica" w:cs="Helvetica"/>
+          <w:sz w:val="24"/>
+          <w:sz-cs w:val="24"/>
+        </w:rPr>
+        <w:t xml:space="preserve"/>
+        <w:tab/>
+        <w:t xml:space="preserve">•</w:t>
+        <w:tab/>
+        <w:t xml:space="preserve"/>
+      </w:r>
+      <w:r>
+        <w:rPr>
+          <w:rFonts w:ascii="Helvetica" w:hAnsi="Helvetica" w:cs="Helvetica"/>
+          <w:sz w:val="24"/>
+          <w:sz-cs w:val="24"/>
+          <w:spacing w:val="0"/>
+        </w:rPr>
+        <w:t xml:space="preserve">I sent the exact amount to the correct account. (fc ×5)</w:t>
+      </w:r>
+    </w:p>
+    <w:p>
+      <w:pPr>
+        <w:ind w:left="720" w:first-line="-720"/>
+      </w:pPr>
+      <w:r>
+        <w:rPr>
+          <w:rFonts w:ascii="Helvetica" w:hAnsi="Helvetica" w:cs="Helvetica"/>
+          <w:sz w:val="24"/>
+          <w:sz-cs w:val="24"/>
+        </w:rPr>
+        <w:t xml:space="preserve"/>
+        <w:tab/>
+        <w:t xml:space="preserve">•</w:t>
+        <w:tab/>
+        <w:t xml:space="preserve"/>
+      </w:r>
+      <w:r>
+        <w:rPr>
+          <w:rFonts w:ascii="Helvetica" w:hAnsi="Helvetica" w:cs="Helvetica"/>
+          <w:sz w:val="24"/>
+          <w:sz-cs w:val="24"/>
+          <w:spacing w:val="0"/>
+        </w:rPr>
+        <w:t xml:space="preserve">Describe the structure of our spring strategy. (tri ×4)</w:t>
+      </w:r>
+    </w:p>
+    <w:p>
+      <w:pPr>
+        <w:ind w:left="720" w:first-line="-720"/>
+      </w:pPr>
+      <w:r>
+        <w:rPr>
+          <w:rFonts w:ascii="Helvetica" w:hAnsi="Helvetica" w:cs="Helvetica"/>
+          <w:sz w:val="24"/>
+          <w:sz-cs w:val="24"/>
+        </w:rPr>
+        <w:t xml:space="preserve"/>
+        <w:tab/>
+        <w:t xml:space="preserve">•</w:t>
+        <w:tab/>
+        <w:t xml:space="preserve"/>
+      </w:r>
+      <w:r>
+        <w:rPr>
+          <w:rFonts w:ascii="Helvetica" w:hAnsi="Helvetica" w:cs="Helvetica"/>
+          <w:sz w:val="24"/>
+          <w:sz-cs w:val="24"/>
+          <w:spacing w:val="0"/>
+        </w:rPr>
+        <w:t xml:space="preserve">Bring the printed brochures to the front desk. (rb ×4)</w:t>
       </w:r>
     </w:p>
     <w:p>
@@ -8788,7 +9230,7 @@
           <w:b/>
           <w:spacing w:val="0"/>
         </w:rPr>
-        <w:t xml:space="preserve">Phone calls (36 words · 30 sentences)</w:t>
+        <w:t xml:space="preserve">Phone calls (36 words · 48 sentences)</w:t>
       </w:r>
     </w:p>
     <w:p>
@@ -9617,6 +10059,474 @@
           <w:spacing w:val="0"/>
         </w:rPr>
         <w:t xml:space="preserve">Thank you for your help — have a good day. (th ×1)</w:t>
+      </w:r>
+    </w:p>
+    <w:p>
+      <w:pPr>
+        <w:ind w:left="720" w:first-line="-720"/>
+      </w:pPr>
+      <w:r>
+        <w:rPr>
+          <w:rFonts w:ascii="Helvetica" w:hAnsi="Helvetica" w:cs="Helvetica"/>
+          <w:sz w:val="24"/>
+          <w:sz-cs w:val="24"/>
+        </w:rPr>
+        <w:t xml:space="preserve"/>
+        <w:tab/>
+        <w:t xml:space="preserve">•</w:t>
+        <w:tab/>
+        <w:t xml:space="preserve"/>
+      </w:r>
+      <w:r>
+        <w:rPr>
+          <w:rFonts w:ascii="Helvetica" w:hAnsi="Helvetica" w:cs="Helvetica"/>
+          <w:sz w:val="24"/>
+          <w:sz-cs w:val="24"/>
+          <w:spacing w:val="0"/>
+        </w:rPr>
+        <w:t xml:space="preserve">Please leave a clear message after the tone. (lb ×2)</w:t>
+      </w:r>
+    </w:p>
+    <w:p>
+      <w:pPr>
+        <w:ind w:left="720" w:first-line="-720"/>
+      </w:pPr>
+      <w:r>
+        <w:rPr>
+          <w:rFonts w:ascii="Helvetica" w:hAnsi="Helvetica" w:cs="Helvetica"/>
+          <w:sz w:val="24"/>
+          <w:sz-cs w:val="24"/>
+        </w:rPr>
+        <w:t xml:space="preserve"/>
+        <w:tab/>
+        <w:t xml:space="preserve">•</w:t>
+        <w:tab/>
+        <w:t xml:space="preserve"/>
+      </w:r>
+      <w:r>
+        <w:rPr>
+          <w:rFonts w:ascii="Helvetica" w:hAnsi="Helvetica" w:cs="Helvetica"/>
+          <w:sz w:val="24"/>
+          <w:sz-cs w:val="24"/>
+          <w:spacing w:val="0"/>
+        </w:rPr>
+        <w:t xml:space="preserve">I think the office opens Thursday morning. (th ×2)</w:t>
+      </w:r>
+    </w:p>
+    <w:p>
+      <w:pPr>
+        <w:ind w:left="720" w:first-line="-720"/>
+      </w:pPr>
+      <w:r>
+        <w:rPr>
+          <w:rFonts w:ascii="Helvetica" w:hAnsi="Helvetica" w:cs="Helvetica"/>
+          <w:sz w:val="24"/>
+          <w:sz-cs w:val="24"/>
+        </w:rPr>
+        <w:t xml:space="preserve"/>
+        <w:tab/>
+        <w:t xml:space="preserve">•</w:t>
+        <w:tab/>
+        <w:t xml:space="preserve"/>
+      </w:r>
+      <w:r>
+        <w:rPr>
+          <w:rFonts w:ascii="Helvetica" w:hAnsi="Helvetica" w:cs="Helvetica"/>
+          <w:sz w:val="24"/>
+          <w:sz-cs w:val="24"/>
+          <w:spacing w:val="0"/>
+        </w:rPr>
+        <w:t xml:space="preserve">I spoke with someone from the billing staff. (sb ×2)</w:t>
+      </w:r>
+    </w:p>
+    <w:p>
+      <w:pPr>
+        <w:ind w:left="720" w:first-line="-720"/>
+      </w:pPr>
+      <w:r>
+        <w:rPr>
+          <w:rFonts w:ascii="Helvetica" w:hAnsi="Helvetica" w:cs="Helvetica"/>
+          <w:sz w:val="24"/>
+          <w:sz-cs w:val="24"/>
+        </w:rPr>
+        <w:t xml:space="preserve"/>
+        <w:tab/>
+        <w:t xml:space="preserve">•</w:t>
+        <w:tab/>
+        <w:t xml:space="preserve"/>
+      </w:r>
+      <w:r>
+        <w:rPr>
+          <w:rFonts w:ascii="Helvetica" w:hAnsi="Helvetica" w:cs="Helvetica"/>
+          <w:sz w:val="24"/>
+          <w:sz-cs w:val="24"/>
+          <w:spacing w:val="0"/>
+        </w:rPr>
+        <w:t xml:space="preserve">Press two to reach a representative. (rb ×2)</w:t>
+      </w:r>
+    </w:p>
+    <w:p>
+      <w:pPr>
+        <w:ind w:left="720" w:first-line="-720"/>
+      </w:pPr>
+      <w:r>
+        <w:rPr>
+          <w:rFonts w:ascii="Helvetica" w:hAnsi="Helvetica" w:cs="Helvetica"/>
+          <w:sz w:val="24"/>
+          <w:sz-cs w:val="24"/>
+        </w:rPr>
+        <w:t xml:space="preserve"/>
+        <w:tab/>
+        <w:t xml:space="preserve">•</w:t>
+        <w:tab/>
+        <w:t xml:space="preserve"/>
+      </w:r>
+      <w:r>
+        <w:rPr>
+          <w:rFonts w:ascii="Helvetica" w:hAnsi="Helvetica" w:cs="Helvetica"/>
+          <w:sz w:val="24"/>
+          <w:sz-cs w:val="24"/>
+          <w:spacing w:val="0"/>
+        </w:rPr>
+        <w:t xml:space="preserve">My second payment posted this morning. (fc ×2)</w:t>
+      </w:r>
+    </w:p>
+    <w:p>
+      <w:pPr>
+        <w:ind w:left="720" w:first-line="-720"/>
+      </w:pPr>
+      <w:r>
+        <w:rPr>
+          <w:rFonts w:ascii="Helvetica" w:hAnsi="Helvetica" w:cs="Helvetica"/>
+          <w:sz w:val="24"/>
+          <w:sz-cs w:val="24"/>
+        </w:rPr>
+        <w:t xml:space="preserve"/>
+        <w:tab/>
+        <w:t xml:space="preserve">•</w:t>
+        <w:tab/>
+        <w:t xml:space="preserve"/>
+      </w:r>
+      <w:r>
+        <w:rPr>
+          <w:rFonts w:ascii="Helvetica" w:hAnsi="Helvetica" w:cs="Helvetica"/>
+          <w:sz w:val="24"/>
+          <w:sz-cs w:val="24"/>
+          <w:spacing w:val="0"/>
+        </w:rPr>
+        <w:t xml:space="preserve">Describe the issue with the streaming service. (tri ×2)</w:t>
+      </w:r>
+    </w:p>
+    <w:p>
+      <w:pPr>
+        <w:ind w:left="720" w:first-line="-720"/>
+      </w:pPr>
+      <w:r>
+        <w:rPr>
+          <w:rFonts w:ascii="Helvetica" w:hAnsi="Helvetica" w:cs="Helvetica"/>
+          <w:sz w:val="24"/>
+          <w:sz-cs w:val="24"/>
+        </w:rPr>
+        <w:t xml:space="preserve"/>
+        <w:tab/>
+        <w:t xml:space="preserve">•</w:t>
+        <w:tab/>
+        <w:t xml:space="preserve"/>
+      </w:r>
+      <w:r>
+        <w:rPr>
+          <w:rFonts w:ascii="Helvetica" w:hAnsi="Helvetica" w:cs="Helvetica"/>
+          <w:sz w:val="24"/>
+          <w:sz-cs w:val="24"/>
+          <w:spacing w:val="0"/>
+        </w:rPr>
+        <w:t xml:space="preserve">Please block the unknown caller. (lb ×2)</w:t>
+      </w:r>
+    </w:p>
+    <w:p>
+      <w:pPr>
+        <w:ind w:left="720" w:first-line="-720"/>
+      </w:pPr>
+      <w:r>
+        <w:rPr>
+          <w:rFonts w:ascii="Helvetica" w:hAnsi="Helvetica" w:cs="Helvetica"/>
+          <w:sz w:val="24"/>
+          <w:sz-cs w:val="24"/>
+        </w:rPr>
+        <w:t xml:space="preserve"/>
+        <w:tab/>
+        <w:t xml:space="preserve">•</w:t>
+        <w:tab/>
+        <w:t xml:space="preserve"/>
+      </w:r>
+      <w:r>
+        <w:rPr>
+          <w:rFonts w:ascii="Helvetica" w:hAnsi="Helvetica" w:cs="Helvetica"/>
+          <w:sz w:val="24"/>
+          <w:sz-cs w:val="24"/>
+          <w:spacing w:val="0"/>
+        </w:rPr>
+        <w:t xml:space="preserve">Thanks for your patience this month. (th ×2)</w:t>
+      </w:r>
+    </w:p>
+    <w:p>
+      <w:pPr>
+        <w:ind w:left="720" w:first-line="-720"/>
+      </w:pPr>
+      <w:r>
+        <w:rPr>
+          <w:rFonts w:ascii="Helvetica" w:hAnsi="Helvetica" w:cs="Helvetica"/>
+          <w:sz w:val="24"/>
+          <w:sz-cs w:val="24"/>
+        </w:rPr>
+        <w:t xml:space="preserve"/>
+        <w:tab/>
+        <w:t xml:space="preserve">•</w:t>
+        <w:tab/>
+        <w:t xml:space="preserve"/>
+      </w:r>
+      <w:r>
+        <w:rPr>
+          <w:rFonts w:ascii="Helvetica" w:hAnsi="Helvetica" w:cs="Helvetica"/>
+          <w:sz w:val="24"/>
+          <w:sz-cs w:val="24"/>
+          <w:spacing w:val="0"/>
+        </w:rPr>
+        <w:t xml:space="preserve">I lost the last four digits of my account. (fc ×4)</w:t>
+      </w:r>
+    </w:p>
+    <w:p>
+      <w:pPr>
+        <w:ind w:left="720" w:first-line="-720"/>
+      </w:pPr>
+      <w:r>
+        <w:rPr>
+          <w:rFonts w:ascii="Helvetica" w:hAnsi="Helvetica" w:cs="Helvetica"/>
+          <w:sz w:val="24"/>
+          <w:sz-cs w:val="24"/>
+        </w:rPr>
+        <w:t xml:space="preserve"/>
+        <w:tab/>
+        <w:t xml:space="preserve">•</w:t>
+        <w:tab/>
+        <w:t xml:space="preserve"/>
+      </w:r>
+      <w:r>
+        <w:rPr>
+          <w:rFonts w:ascii="Helvetica" w:hAnsi="Helvetica" w:cs="Helvetica"/>
+          <w:sz w:val="24"/>
+          <w:sz-cs w:val="24"/>
+          <w:spacing w:val="0"/>
+        </w:rPr>
+        <w:t xml:space="preserve">I found the correct amount on my bill. (fc ×3)</w:t>
+      </w:r>
+    </w:p>
+    <w:p>
+      <w:pPr>
+        <w:ind w:left="720" w:first-line="-720"/>
+      </w:pPr>
+      <w:r>
+        <w:rPr>
+          <w:rFonts w:ascii="Helvetica" w:hAnsi="Helvetica" w:cs="Helvetica"/>
+          <w:sz w:val="24"/>
+          <w:sz-cs w:val="24"/>
+        </w:rPr>
+        <w:t xml:space="preserve"/>
+        <w:tab/>
+        <w:t xml:space="preserve">•</w:t>
+        <w:tab/>
+        <w:t xml:space="preserve"/>
+      </w:r>
+      <w:r>
+        <w:rPr>
+          <w:rFonts w:ascii="Helvetica" w:hAnsi="Helvetica" w:cs="Helvetica"/>
+          <w:sz w:val="24"/>
+          <w:sz-cs w:val="24"/>
+          <w:spacing w:val="0"/>
+        </w:rPr>
+        <w:t xml:space="preserve">I live on Spring Street near the strip mall. (tri ×3)</w:t>
+      </w:r>
+    </w:p>
+    <w:p>
+      <w:pPr>
+        <w:ind w:left="720" w:first-line="-720"/>
+      </w:pPr>
+      <w:r>
+        <w:rPr>
+          <w:rFonts w:ascii="Helvetica" w:hAnsi="Helvetica" w:cs="Helvetica"/>
+          <w:sz w:val="24"/>
+          <w:sz-cs w:val="24"/>
+        </w:rPr>
+        <w:t xml:space="preserve"/>
+        <w:tab/>
+        <w:t xml:space="preserve">•</w:t>
+        <w:tab/>
+        <w:t xml:space="preserve"/>
+      </w:r>
+      <w:r>
+        <w:rPr>
+          <w:rFonts w:ascii="Helvetica" w:hAnsi="Helvetica" w:cs="Helvetica"/>
+          <w:sz w:val="24"/>
+          <w:sz-cs w:val="24"/>
+          <w:spacing w:val="0"/>
+        </w:rPr>
+        <w:t xml:space="preserve">The representative promised a prompt response. (rb ×3)</w:t>
+      </w:r>
+    </w:p>
+    <w:p>
+      <w:pPr>
+        <w:ind w:left="720" w:first-line="-720"/>
+      </w:pPr>
+      <w:r>
+        <w:rPr>
+          <w:rFonts w:ascii="Helvetica" w:hAnsi="Helvetica" w:cs="Helvetica"/>
+          <w:sz w:val="24"/>
+          <w:sz-cs w:val="24"/>
+        </w:rPr>
+        <w:t xml:space="preserve"/>
+        <w:tab/>
+        <w:t xml:space="preserve">•</w:t>
+        <w:tab/>
+        <w:t xml:space="preserve"/>
+      </w:r>
+      <w:r>
+        <w:rPr>
+          <w:rFonts w:ascii="Helvetica" w:hAnsi="Helvetica" w:cs="Helvetica"/>
+          <w:sz w:val="24"/>
+          <w:sz-cs w:val="24"/>
+          <w:spacing w:val="0"/>
+        </w:rPr>
+        <w:t xml:space="preserve">My provider dropped the price on Friday. (rb ×4)</w:t>
+      </w:r>
+    </w:p>
+    <w:p>
+      <w:pPr>
+        <w:ind w:left="720" w:first-line="-720"/>
+      </w:pPr>
+      <w:r>
+        <w:rPr>
+          <w:rFonts w:ascii="Helvetica" w:hAnsi="Helvetica" w:cs="Helvetica"/>
+          <w:sz w:val="24"/>
+          <w:sz-cs w:val="24"/>
+        </w:rPr>
+        <w:t xml:space="preserve"/>
+        <w:tab/>
+        <w:t xml:space="preserve">•</w:t>
+        <w:tab/>
+        <w:t xml:space="preserve"/>
+      </w:r>
+      <w:r>
+        <w:rPr>
+          <w:rFonts w:ascii="Helvetica" w:hAnsi="Helvetica" w:cs="Helvetica"/>
+          <w:sz w:val="24"/>
+          <w:sz-cs w:val="24"/>
+          <w:spacing w:val="0"/>
+        </w:rPr>
+        <w:t xml:space="preserve">Thank you for another thorough answer. (th ×3)</w:t>
+      </w:r>
+    </w:p>
+    <w:p>
+      <w:pPr>
+        <w:ind w:left="720" w:first-line="-720"/>
+      </w:pPr>
+      <w:r>
+        <w:rPr>
+          <w:rFonts w:ascii="Helvetica" w:hAnsi="Helvetica" w:cs="Helvetica"/>
+          <w:sz w:val="24"/>
+          <w:sz-cs w:val="24"/>
+        </w:rPr>
+        <w:t xml:space="preserve"/>
+        <w:tab/>
+        <w:t xml:space="preserve">•</w:t>
+        <w:tab/>
+        <w:t xml:space="preserve"/>
+      </w:r>
+      <w:r>
+        <w:rPr>
+          <w:rFonts w:ascii="Helvetica" w:hAnsi="Helvetica" w:cs="Helvetica"/>
+          <w:sz w:val="24"/>
+          <w:sz-cs w:val="24"/>
+          <w:spacing w:val="0"/>
+        </w:rPr>
+        <w:t xml:space="preserve">My spouse spoke to the billing staff. (sb ×3)</w:t>
+      </w:r>
+    </w:p>
+    <w:p>
+      <w:pPr>
+        <w:ind w:left="720" w:first-line="-720"/>
+      </w:pPr>
+      <w:r>
+        <w:rPr>
+          <w:rFonts w:ascii="Helvetica" w:hAnsi="Helvetica" w:cs="Helvetica"/>
+          <w:sz w:val="24"/>
+          <w:sz-cs w:val="24"/>
+        </w:rPr>
+        <w:t xml:space="preserve"/>
+        <w:tab/>
+        <w:t xml:space="preserve">•</w:t>
+        <w:tab/>
+        <w:t xml:space="preserve"/>
+      </w:r>
+      <w:r>
+        <w:rPr>
+          <w:rFonts w:ascii="Helvetica" w:hAnsi="Helvetica" w:cs="Helvetica"/>
+          <w:sz w:val="24"/>
+          <w:sz-cs w:val="24"/>
+          <w:spacing w:val="0"/>
+        </w:rPr>
+        <w:t xml:space="preserve">Please click the blue link and reply. (lb ×4)</w:t>
+      </w:r>
+    </w:p>
+    <w:p>
+      <w:pPr>
+        <w:ind w:left="720" w:first-line="-720"/>
+      </w:pPr>
+      <w:r>
+        <w:rPr>
+          <w:rFonts w:ascii="Helvetica" w:hAnsi="Helvetica" w:cs="Helvetica"/>
+          <w:sz w:val="24"/>
+          <w:sz-cs w:val="24"/>
+        </w:rPr>
+        <w:t xml:space="preserve"/>
+        <w:tab/>
+        <w:t xml:space="preserve">•</w:t>
+        <w:tab/>
+        <w:t xml:space="preserve"/>
+      </w:r>
+      <w:r>
+        <w:rPr>
+          <w:rFonts w:ascii="Helvetica" w:hAnsi="Helvetica" w:cs="Helvetica"/>
+          <w:sz w:val="24"/>
+          <w:sz-cs w:val="24"/>
+          <w:spacing w:val="0"/>
+        </w:rPr>
+        <w:t xml:space="preserve">The plan includes unlimited calls and clear billing. (lb ×3)</w:t>
+      </w:r>
+    </w:p>
+    <w:p>
+      <w:pPr>
+        <w:ind w:left="720" w:first-line="-720"/>
+      </w:pPr>
+      <w:r>
+        <w:rPr>
+          <w:rFonts w:ascii="Helvetica" w:hAnsi="Helvetica" w:cs="Helvetica"/>
+          <w:sz w:val="24"/>
+          <w:sz-cs w:val="24"/>
+        </w:rPr>
+        <w:t xml:space="preserve"/>
+        <w:tab/>
+        <w:t xml:space="preserve">•</w:t>
+        <w:tab/>
+        <w:t xml:space="preserve"/>
+      </w:r>
+      <w:r>
+        <w:rPr>
+          <w:rFonts w:ascii="Helvetica" w:hAnsi="Helvetica" w:cs="Helvetica"/>
+          <w:sz w:val="24"/>
+          <w:sz-cs w:val="24"/>
+          <w:spacing w:val="0"/>
+        </w:rPr>
+        <w:t xml:space="preserve">The strong signal streams without a struggle. (tri ×3)</w:t>
       </w:r>
     </w:p>
     <w:p>
@@ -9631,7 +10541,7 @@
           <w:b/>
           <w:spacing w:val="0"/>
         </w:rPr>
-        <w:t xml:space="preserve">Family &amp; social (38 words · 30 sentences)</w:t>
+        <w:t xml:space="preserve">Family &amp; social (38 words · 49 sentences)</w:t>
       </w:r>
     </w:p>
     <w:p>
@@ -10460,6 +11370,500 @@
           <w:spacing w:val="0"/>
         </w:rPr>
         <w:t xml:space="preserve">Come visit us again soon — anytime.</w:t>
+      </w:r>
+    </w:p>
+    <w:p>
+      <w:pPr>
+        <w:ind w:left="720" w:first-line="-720"/>
+      </w:pPr>
+      <w:r>
+        <w:rPr>
+          <w:rFonts w:ascii="Helvetica" w:hAnsi="Helvetica" w:cs="Helvetica"/>
+          <w:sz w:val="24"/>
+          <w:sz-cs w:val="24"/>
+        </w:rPr>
+        <w:t xml:space="preserve"/>
+        <w:tab/>
+        <w:t xml:space="preserve">•</w:t>
+        <w:tab/>
+        <w:t xml:space="preserve"/>
+      </w:r>
+      <w:r>
+        <w:rPr>
+          <w:rFonts w:ascii="Helvetica" w:hAnsi="Helvetica" w:cs="Helvetica"/>
+          <w:sz w:val="24"/>
+          <w:sz-cs w:val="24"/>
+          <w:spacing w:val="0"/>
+        </w:rPr>
+        <w:t xml:space="preserve">My mother loves the autumn weather. (th ×2)</w:t>
+      </w:r>
+    </w:p>
+    <w:p>
+      <w:pPr>
+        <w:ind w:left="720" w:first-line="-720"/>
+      </w:pPr>
+      <w:r>
+        <w:rPr>
+          <w:rFonts w:ascii="Helvetica" w:hAnsi="Helvetica" w:cs="Helvetica"/>
+          <w:sz w:val="24"/>
+          <w:sz-cs w:val="24"/>
+        </w:rPr>
+        <w:t xml:space="preserve"/>
+        <w:tab/>
+        <w:t xml:space="preserve">•</w:t>
+        <w:tab/>
+        <w:t xml:space="preserve"/>
+      </w:r>
+      <w:r>
+        <w:rPr>
+          <w:rFonts w:ascii="Helvetica" w:hAnsi="Helvetica" w:cs="Helvetica"/>
+          <w:sz w:val="24"/>
+          <w:sz-cs w:val="24"/>
+          <w:spacing w:val="0"/>
+        </w:rPr>
+        <w:t xml:space="preserve">Thank your father for the ride home. (th ×2)</w:t>
+      </w:r>
+    </w:p>
+    <w:p>
+      <w:pPr>
+        <w:ind w:left="720" w:first-line="-720"/>
+      </w:pPr>
+      <w:r>
+        <w:rPr>
+          <w:rFonts w:ascii="Helvetica" w:hAnsi="Helvetica" w:cs="Helvetica"/>
+          <w:sz w:val="24"/>
+          <w:sz-cs w:val="24"/>
+        </w:rPr>
+        <w:t xml:space="preserve"/>
+        <w:tab/>
+        <w:t xml:space="preserve">•</w:t>
+        <w:tab/>
+        <w:t xml:space="preserve"/>
+      </w:r>
+      <w:r>
+        <w:rPr>
+          <w:rFonts w:ascii="Helvetica" w:hAnsi="Helvetica" w:cs="Helvetica"/>
+          <w:sz w:val="24"/>
+          <w:sz-cs w:val="24"/>
+          <w:spacing w:val="0"/>
+        </w:rPr>
+        <w:t xml:space="preserve">My granddaughter draws me pictures. (rb ×2)</w:t>
+      </w:r>
+    </w:p>
+    <w:p>
+      <w:pPr>
+        <w:ind w:left="720" w:first-line="-720"/>
+      </w:pPr>
+      <w:r>
+        <w:rPr>
+          <w:rFonts w:ascii="Helvetica" w:hAnsi="Helvetica" w:cs="Helvetica"/>
+          <w:sz w:val="24"/>
+          <w:sz-cs w:val="24"/>
+        </w:rPr>
+        <w:t xml:space="preserve"/>
+        <w:tab/>
+        <w:t xml:space="preserve">•</w:t>
+        <w:tab/>
+        <w:t xml:space="preserve"/>
+      </w:r>
+      <w:r>
+        <w:rPr>
+          <w:rFonts w:ascii="Helvetica" w:hAnsi="Helvetica" w:cs="Helvetica"/>
+          <w:sz w:val="24"/>
+          <w:sz-cs w:val="24"/>
+          <w:spacing w:val="0"/>
+        </w:rPr>
+        <w:t xml:space="preserve">Grandpa grilled chicken for everyone. (rb ×2)</w:t>
+      </w:r>
+    </w:p>
+    <w:p>
+      <w:pPr>
+        <w:ind w:left="720" w:first-line="-720"/>
+      </w:pPr>
+      <w:r>
+        <w:rPr>
+          <w:rFonts w:ascii="Helvetica" w:hAnsi="Helvetica" w:cs="Helvetica"/>
+          <w:sz w:val="24"/>
+          <w:sz-cs w:val="24"/>
+        </w:rPr>
+        <w:t xml:space="preserve"/>
+        <w:tab/>
+        <w:t xml:space="preserve">•</w:t>
+        <w:tab/>
+        <w:t xml:space="preserve"/>
+      </w:r>
+      <w:r>
+        <w:rPr>
+          <w:rFonts w:ascii="Helvetica" w:hAnsi="Helvetica" w:cs="Helvetica"/>
+          <w:sz w:val="24"/>
+          <w:sz-cs w:val="24"/>
+          <w:spacing w:val="0"/>
+        </w:rPr>
+        <w:t xml:space="preserve">We swapped stories at the picnic. (sb ×2)</w:t>
+      </w:r>
+    </w:p>
+    <w:p>
+      <w:pPr>
+        <w:ind w:left="720" w:first-line="-720"/>
+      </w:pPr>
+      <w:r>
+        <w:rPr>
+          <w:rFonts w:ascii="Helvetica" w:hAnsi="Helvetica" w:cs="Helvetica"/>
+          <w:sz w:val="24"/>
+          <w:sz-cs w:val="24"/>
+        </w:rPr>
+        <w:t xml:space="preserve"/>
+        <w:tab/>
+        <w:t xml:space="preserve">•</w:t>
+        <w:tab/>
+        <w:t xml:space="preserve"/>
+      </w:r>
+      <w:r>
+        <w:rPr>
+          <w:rFonts w:ascii="Helvetica" w:hAnsi="Helvetica" w:cs="Helvetica"/>
+          <w:sz w:val="24"/>
+          <w:sz-cs w:val="24"/>
+          <w:spacing w:val="0"/>
+        </w:rPr>
+        <w:t xml:space="preserve">We planned a classic family barbecue. (lb ×2)</w:t>
+      </w:r>
+    </w:p>
+    <w:p>
+      <w:pPr>
+        <w:ind w:left="720" w:first-line="-720"/>
+      </w:pPr>
+      <w:r>
+        <w:rPr>
+          <w:rFonts w:ascii="Helvetica" w:hAnsi="Helvetica" w:cs="Helvetica"/>
+          <w:sz w:val="24"/>
+          <w:sz-cs w:val="24"/>
+        </w:rPr>
+        <w:t xml:space="preserve"/>
+        <w:tab/>
+        <w:t xml:space="preserve">•</w:t>
+        <w:tab/>
+        <w:t xml:space="preserve"/>
+      </w:r>
+      <w:r>
+        <w:rPr>
+          <w:rFonts w:ascii="Helvetica" w:hAnsi="Helvetica" w:cs="Helvetica"/>
+          <w:sz w:val="24"/>
+          <w:sz-cs w:val="24"/>
+          <w:spacing w:val="0"/>
+        </w:rPr>
+        <w:t xml:space="preserve">The whole family went to the concert. (fc ×2)</w:t>
+      </w:r>
+    </w:p>
+    <w:p>
+      <w:pPr>
+        <w:ind w:left="720" w:first-line="-720"/>
+      </w:pPr>
+      <w:r>
+        <w:rPr>
+          <w:rFonts w:ascii="Helvetica" w:hAnsi="Helvetica" w:cs="Helvetica"/>
+          <w:sz w:val="24"/>
+          <w:sz-cs w:val="24"/>
+        </w:rPr>
+        <w:t xml:space="preserve"/>
+        <w:tab/>
+        <w:t xml:space="preserve">•</w:t>
+        <w:tab/>
+        <w:t xml:space="preserve"/>
+      </w:r>
+      <w:r>
+        <w:rPr>
+          <w:rFonts w:ascii="Helvetica" w:hAnsi="Helvetica" w:cs="Helvetica"/>
+          <w:sz w:val="24"/>
+          <w:sz-cs w:val="24"/>
+          <w:spacing w:val="0"/>
+        </w:rPr>
+        <w:t xml:space="preserve">The kids sprayed the strawberries with the hose. (tri ×2)</w:t>
+      </w:r>
+    </w:p>
+    <w:p>
+      <w:pPr>
+        <w:ind w:left="720" w:first-line="-720"/>
+      </w:pPr>
+      <w:r>
+        <w:rPr>
+          <w:rFonts w:ascii="Helvetica" w:hAnsi="Helvetica" w:cs="Helvetica"/>
+          <w:sz w:val="24"/>
+          <w:sz-cs w:val="24"/>
+        </w:rPr>
+        <w:t xml:space="preserve"/>
+        <w:tab/>
+        <w:t xml:space="preserve">•</w:t>
+        <w:tab/>
+        <w:t xml:space="preserve"/>
+      </w:r>
+      <w:r>
+        <w:rPr>
+          <w:rFonts w:ascii="Helvetica" w:hAnsi="Helvetica" w:cs="Helvetica"/>
+          <w:sz w:val="24"/>
+          <w:sz-cs w:val="24"/>
+          <w:spacing w:val="0"/>
+        </w:rPr>
+        <w:t xml:space="preserve">My brother thinks we should host Thanksgiving. (th ×3)</w:t>
+      </w:r>
+    </w:p>
+    <w:p>
+      <w:pPr>
+        <w:ind w:left="720" w:first-line="-720"/>
+      </w:pPr>
+      <w:r>
+        <w:rPr>
+          <w:rFonts w:ascii="Helvetica" w:hAnsi="Helvetica" w:cs="Helvetica"/>
+          <w:sz w:val="24"/>
+          <w:sz-cs w:val="24"/>
+        </w:rPr>
+        <w:t xml:space="preserve"/>
+        <w:tab/>
+        <w:t xml:space="preserve">•</w:t>
+        <w:tab/>
+        <w:t xml:space="preserve"/>
+      </w:r>
+      <w:r>
+        <w:rPr>
+          <w:rFonts w:ascii="Helvetica" w:hAnsi="Helvetica" w:cs="Helvetica"/>
+          <w:sz w:val="24"/>
+          <w:sz-cs w:val="24"/>
+          <w:spacing w:val="0"/>
+        </w:rPr>
+        <w:t xml:space="preserve">My mother and father visit on Thursdays. (th ×3)</w:t>
+      </w:r>
+    </w:p>
+    <w:p>
+      <w:pPr>
+        <w:ind w:left="720" w:first-line="-720"/>
+      </w:pPr>
+      <w:r>
+        <w:rPr>
+          <w:rFonts w:ascii="Helvetica" w:hAnsi="Helvetica" w:cs="Helvetica"/>
+          <w:sz w:val="24"/>
+          <w:sz-cs w:val="24"/>
+        </w:rPr>
+        <w:t xml:space="preserve"/>
+        <w:tab/>
+        <w:t xml:space="preserve">•</w:t>
+        <w:tab/>
+        <w:t xml:space="preserve"/>
+      </w:r>
+      <w:r>
+        <w:rPr>
+          <w:rFonts w:ascii="Helvetica" w:hAnsi="Helvetica" w:cs="Helvetica"/>
+          <w:sz w:val="24"/>
+          <w:sz-cs w:val="24"/>
+          <w:spacing w:val="0"/>
+        </w:rPr>
+        <w:t xml:space="preserve">The kids played on the blue slide. (lb ×3)</w:t>
+      </w:r>
+    </w:p>
+    <w:p>
+      <w:pPr>
+        <w:ind w:left="720" w:first-line="-720"/>
+      </w:pPr>
+      <w:r>
+        <w:rPr>
+          <w:rFonts w:ascii="Helvetica" w:hAnsi="Helvetica" w:cs="Helvetica"/>
+          <w:sz w:val="24"/>
+          <w:sz-cs w:val="24"/>
+        </w:rPr>
+        <w:t xml:space="preserve"/>
+        <w:tab/>
+        <w:t xml:space="preserve">•</w:t>
+        <w:tab/>
+        <w:t xml:space="preserve"/>
+      </w:r>
+      <w:r>
+        <w:rPr>
+          <w:rFonts w:ascii="Helvetica" w:hAnsi="Helvetica" w:cs="Helvetica"/>
+          <w:sz w:val="24"/>
+          <w:sz-cs w:val="24"/>
+          <w:spacing w:val="0"/>
+        </w:rPr>
+        <w:t xml:space="preserve">My aunt sent a gift for the twins. (fc ×4)</w:t>
+      </w:r>
+    </w:p>
+    <w:p>
+      <w:pPr>
+        <w:ind w:left="720" w:first-line="-720"/>
+      </w:pPr>
+      <w:r>
+        <w:rPr>
+          <w:rFonts w:ascii="Helvetica" w:hAnsi="Helvetica" w:cs="Helvetica"/>
+          <w:sz w:val="24"/>
+          <w:sz-cs w:val="24"/>
+        </w:rPr>
+        <w:t xml:space="preserve"/>
+        <w:tab/>
+        <w:t xml:space="preserve">•</w:t>
+        <w:tab/>
+        <w:t xml:space="preserve"/>
+      </w:r>
+      <w:r>
+        <w:rPr>
+          <w:rFonts w:ascii="Helvetica" w:hAnsi="Helvetica" w:cs="Helvetica"/>
+          <w:sz w:val="24"/>
+          <w:sz-cs w:val="24"/>
+          <w:spacing w:val="0"/>
+        </w:rPr>
+        <w:t xml:space="preserve">My grandchildren bring me great pride. (rb ×5)</w:t>
+      </w:r>
+    </w:p>
+    <w:p>
+      <w:pPr>
+        <w:ind w:left="720" w:first-line="-720"/>
+      </w:pPr>
+      <w:r>
+        <w:rPr>
+          <w:rFonts w:ascii="Helvetica" w:hAnsi="Helvetica" w:cs="Helvetica"/>
+          <w:sz w:val="24"/>
+          <w:sz-cs w:val="24"/>
+        </w:rPr>
+        <w:t xml:space="preserve"/>
+        <w:tab/>
+        <w:t xml:space="preserve">•</w:t>
+        <w:tab/>
+        <w:t xml:space="preserve"/>
+      </w:r>
+      <w:r>
+        <w:rPr>
+          <w:rFonts w:ascii="Helvetica" w:hAnsi="Helvetica" w:cs="Helvetica"/>
+          <w:sz w:val="24"/>
+          <w:sz-cs w:val="24"/>
+          <w:spacing w:val="0"/>
+        </w:rPr>
+        <w:t xml:space="preserve">Grandma brought fresh bread to the party. (rb ×4)</w:t>
+      </w:r>
+    </w:p>
+    <w:p>
+      <w:pPr>
+        <w:ind w:left="720" w:first-line="-720"/>
+      </w:pPr>
+      <w:r>
+        <w:rPr>
+          <w:rFonts w:ascii="Helvetica" w:hAnsi="Helvetica" w:cs="Helvetica"/>
+          <w:sz w:val="24"/>
+          <w:sz-cs w:val="24"/>
+        </w:rPr>
+        <w:t xml:space="preserve"/>
+        <w:tab/>
+        <w:t xml:space="preserve">•</w:t>
+        <w:tab/>
+        <w:t xml:space="preserve"/>
+      </w:r>
+      <w:r>
+        <w:rPr>
+          <w:rFonts w:ascii="Helvetica" w:hAnsi="Helvetica" w:cs="Helvetica"/>
+          <w:sz w:val="24"/>
+          <w:sz-cs w:val="24"/>
+          <w:spacing w:val="0"/>
+        </w:rPr>
+        <w:t xml:space="preserve">We stacked the snacks on the picnic stand. (sb ×3)</w:t>
+      </w:r>
+    </w:p>
+    <w:p>
+      <w:pPr>
+        <w:ind w:left="720" w:first-line="-720"/>
+      </w:pPr>
+      <w:r>
+        <w:rPr>
+          <w:rFonts w:ascii="Helvetica" w:hAnsi="Helvetica" w:cs="Helvetica"/>
+          <w:sz w:val="24"/>
+          <w:sz-cs w:val="24"/>
+        </w:rPr>
+        <w:t xml:space="preserve"/>
+        <w:tab/>
+        <w:t xml:space="preserve">•</w:t>
+        <w:tab/>
+        <w:t xml:space="preserve"/>
+      </w:r>
+      <w:r>
+        <w:rPr>
+          <w:rFonts w:ascii="Helvetica" w:hAnsi="Helvetica" w:cs="Helvetica"/>
+          <w:sz w:val="24"/>
+          <w:sz-cs w:val="24"/>
+          <w:spacing w:val="0"/>
+        </w:rPr>
+        <w:t xml:space="preserve">Please place the plates by the blue blanket. (lb ×5)</w:t>
+      </w:r>
+    </w:p>
+    <w:p>
+      <w:pPr>
+        <w:ind w:left="720" w:first-line="-720"/>
+      </w:pPr>
+      <w:r>
+        <w:rPr>
+          <w:rFonts w:ascii="Helvetica" w:hAnsi="Helvetica" w:cs="Helvetica"/>
+          <w:sz w:val="24"/>
+          <w:sz-cs w:val="24"/>
+        </w:rPr>
+        <w:t xml:space="preserve"/>
+        <w:tab/>
+        <w:t xml:space="preserve">•</w:t>
+        <w:tab/>
+        <w:t xml:space="preserve"/>
+      </w:r>
+      <w:r>
+        <w:rPr>
+          <w:rFonts w:ascii="Helvetica" w:hAnsi="Helvetica" w:cs="Helvetica"/>
+          <w:sz w:val="24"/>
+          <w:sz-cs w:val="24"/>
+          <w:spacing w:val="0"/>
+        </w:rPr>
+        <w:t xml:space="preserve">The kids screamed and sprinted through the sprinkler. (tri ×4)</w:t>
+      </w:r>
+    </w:p>
+    <w:p>
+      <w:pPr>
+        <w:ind w:left="720" w:first-line="-720"/>
+      </w:pPr>
+      <w:r>
+        <w:rPr>
+          <w:rFonts w:ascii="Helvetica" w:hAnsi="Helvetica" w:cs="Helvetica"/>
+          <w:sz w:val="24"/>
+          <w:sz-cs w:val="24"/>
+        </w:rPr>
+        <w:t xml:space="preserve"/>
+        <w:tab/>
+        <w:t xml:space="preserve">•</w:t>
+        <w:tab/>
+        <w:t xml:space="preserve"/>
+      </w:r>
+      <w:r>
+        <w:rPr>
+          <w:rFonts w:ascii="Helvetica" w:hAnsi="Helvetica" w:cs="Helvetica"/>
+          <w:sz w:val="24"/>
+          <w:sz-cs w:val="24"/>
+          <w:spacing w:val="0"/>
+        </w:rPr>
+        <w:t xml:space="preserve">We gathered together every third Thursday. (th ×4)</w:t>
+      </w:r>
+    </w:p>
+    <w:p>
+      <w:pPr>
+        <w:ind w:left="720" w:first-line="-720"/>
+      </w:pPr>
+      <w:r>
+        <w:rPr>
+          <w:rFonts w:ascii="Helvetica" w:hAnsi="Helvetica" w:cs="Helvetica"/>
+          <w:sz w:val="24"/>
+          <w:sz-cs w:val="24"/>
+        </w:rPr>
+        <w:t xml:space="preserve"/>
+        <w:tab/>
+        <w:t xml:space="preserve">•</w:t>
+        <w:tab/>
+        <w:t xml:space="preserve"/>
+      </w:r>
+      <w:r>
+        <w:rPr>
+          <w:rFonts w:ascii="Helvetica" w:hAnsi="Helvetica" w:cs="Helvetica"/>
+          <w:sz w:val="24"/>
+          <w:sz-cs w:val="24"/>
+          <w:spacing w:val="0"/>
+        </w:rPr>
+        <w:t xml:space="preserve">My cousins went camping last August. (fc ×4)</w:t>
       </w:r>
     </w:p>
     <w:p>
@@ -10474,7 +11878,7 @@
           <w:b/>
           <w:spacing w:val="0"/>
         </w:rPr>
-        <w:t xml:space="preserve">Shopping (34 words · 30 sentences)</w:t>
+        <w:t xml:space="preserve">Shopping (34 words · 46 sentences)</w:t>
       </w:r>
     </w:p>
     <w:p>
@@ -11303,6 +12707,422 @@
           <w:spacing w:val="0"/>
         </w:rPr>
         <w:t xml:space="preserve">Could you double-bag that, please? It's heavy. (lb ×2)</w:t>
+      </w:r>
+    </w:p>
+    <w:p>
+      <w:pPr>
+        <w:ind w:left="720" w:first-line="-720"/>
+      </w:pPr>
+      <w:r>
+        <w:rPr>
+          <w:rFonts w:ascii="Helvetica" w:hAnsi="Helvetica" w:cs="Helvetica"/>
+          <w:sz w:val="24"/>
+          <w:sz-cs w:val="24"/>
+        </w:rPr>
+        <w:t xml:space="preserve"/>
+        <w:tab/>
+        <w:t xml:space="preserve">•</w:t>
+        <w:tab/>
+        <w:t xml:space="preserve"/>
+      </w:r>
+      <w:r>
+        <w:rPr>
+          <w:rFonts w:ascii="Helvetica" w:hAnsi="Helvetica" w:cs="Helvetica"/>
+          <w:sz w:val="24"/>
+          <w:sz-cs w:val="24"/>
+          <w:spacing w:val="0"/>
+        </w:rPr>
+        <w:t xml:space="preserve">The clerk placed my card on file. (lb ×2)</w:t>
+      </w:r>
+    </w:p>
+    <w:p>
+      <w:pPr>
+        <w:ind w:left="720" w:first-line="-720"/>
+      </w:pPr>
+      <w:r>
+        <w:rPr>
+          <w:rFonts w:ascii="Helvetica" w:hAnsi="Helvetica" w:cs="Helvetica"/>
+          <w:sz w:val="24"/>
+          <w:sz-cs w:val="24"/>
+        </w:rPr>
+        <w:t xml:space="preserve"/>
+        <w:tab/>
+        <w:t xml:space="preserve">•</w:t>
+        <w:tab/>
+        <w:t xml:space="preserve"/>
+      </w:r>
+      <w:r>
+        <w:rPr>
+          <w:rFonts w:ascii="Helvetica" w:hAnsi="Helvetica" w:cs="Helvetica"/>
+          <w:sz w:val="24"/>
+          <w:sz-cs w:val="24"/>
+          <w:spacing w:val="0"/>
+        </w:rPr>
+        <w:t xml:space="preserve">The produce here is always fresh. (rb ×2)</w:t>
+      </w:r>
+    </w:p>
+    <w:p>
+      <w:pPr>
+        <w:ind w:left="720" w:first-line="-720"/>
+      </w:pPr>
+      <w:r>
+        <w:rPr>
+          <w:rFonts w:ascii="Helvetica" w:hAnsi="Helvetica" w:cs="Helvetica"/>
+          <w:sz w:val="24"/>
+          <w:sz-cs w:val="24"/>
+        </w:rPr>
+        <w:t xml:space="preserve"/>
+        <w:tab/>
+        <w:t xml:space="preserve">•</w:t>
+        <w:tab/>
+        <w:t xml:space="preserve"/>
+      </w:r>
+      <w:r>
+        <w:rPr>
+          <w:rFonts w:ascii="Helvetica" w:hAnsi="Helvetica" w:cs="Helvetica"/>
+          <w:sz w:val="24"/>
+          <w:sz-cs w:val="24"/>
+          <w:spacing w:val="0"/>
+        </w:rPr>
+        <w:t xml:space="preserve">I scanned the sticker at self-checkout. (sb ×2)</w:t>
+      </w:r>
+    </w:p>
+    <w:p>
+      <w:pPr>
+        <w:ind w:left="720" w:first-line="-720"/>
+      </w:pPr>
+      <w:r>
+        <w:rPr>
+          <w:rFonts w:ascii="Helvetica" w:hAnsi="Helvetica" w:cs="Helvetica"/>
+          <w:sz w:val="24"/>
+          <w:sz-cs w:val="24"/>
+        </w:rPr>
+        <w:t xml:space="preserve"/>
+        <w:tab/>
+        <w:t xml:space="preserve">•</w:t>
+        <w:tab/>
+        <w:t xml:space="preserve"/>
+      </w:r>
+      <w:r>
+        <w:rPr>
+          <w:rFonts w:ascii="Helvetica" w:hAnsi="Helvetica" w:cs="Helvetica"/>
+          <w:sz w:val="24"/>
+          <w:sz-cs w:val="24"/>
+          <w:spacing w:val="0"/>
+        </w:rPr>
+        <w:t xml:space="preserve">I think this brand is worth the price. (th ×2)</w:t>
+      </w:r>
+    </w:p>
+    <w:p>
+      <w:pPr>
+        <w:ind w:left="720" w:first-line="-720"/>
+      </w:pPr>
+      <w:r>
+        <w:rPr>
+          <w:rFonts w:ascii="Helvetica" w:hAnsi="Helvetica" w:cs="Helvetica"/>
+          <w:sz w:val="24"/>
+          <w:sz-cs w:val="24"/>
+        </w:rPr>
+        <w:t xml:space="preserve"/>
+        <w:tab/>
+        <w:t xml:space="preserve">•</w:t>
+        <w:tab/>
+        <w:t xml:space="preserve"/>
+      </w:r>
+      <w:r>
+        <w:rPr>
+          <w:rFonts w:ascii="Helvetica" w:hAnsi="Helvetica" w:cs="Helvetica"/>
+          <w:sz w:val="24"/>
+          <w:sz-cs w:val="24"/>
+          <w:spacing w:val="0"/>
+        </w:rPr>
+        <w:t xml:space="preserve">I kept the receipt in my wallet. (fc ×2)</w:t>
+      </w:r>
+    </w:p>
+    <w:p>
+      <w:pPr>
+        <w:ind w:left="720" w:first-line="-720"/>
+      </w:pPr>
+      <w:r>
+        <w:rPr>
+          <w:rFonts w:ascii="Helvetica" w:hAnsi="Helvetica" w:cs="Helvetica"/>
+          <w:sz w:val="24"/>
+          <w:sz-cs w:val="24"/>
+        </w:rPr>
+        <w:t xml:space="preserve"/>
+        <w:tab/>
+        <w:t xml:space="preserve">•</w:t>
+        <w:tab/>
+        <w:t xml:space="preserve"/>
+      </w:r>
+      <w:r>
+        <w:rPr>
+          <w:rFonts w:ascii="Helvetica" w:hAnsi="Helvetica" w:cs="Helvetica"/>
+          <w:sz w:val="24"/>
+          <w:sz-cs w:val="24"/>
+          <w:spacing w:val="0"/>
+        </w:rPr>
+        <w:t xml:space="preserve">Please place the milk in a plastic bag. (lb ×3)</w:t>
+      </w:r>
+    </w:p>
+    <w:p>
+      <w:pPr>
+        <w:ind w:left="720" w:first-line="-720"/>
+      </w:pPr>
+      <w:r>
+        <w:rPr>
+          <w:rFonts w:ascii="Helvetica" w:hAnsi="Helvetica" w:cs="Helvetica"/>
+          <w:sz w:val="24"/>
+          <w:sz-cs w:val="24"/>
+        </w:rPr>
+        <w:t xml:space="preserve"/>
+        <w:tab/>
+        <w:t xml:space="preserve">•</w:t>
+        <w:tab/>
+        <w:t xml:space="preserve"/>
+      </w:r>
+      <w:r>
+        <w:rPr>
+          <w:rFonts w:ascii="Helvetica" w:hAnsi="Helvetica" w:cs="Helvetica"/>
+          <w:sz w:val="24"/>
+          <w:sz-cs w:val="24"/>
+          <w:spacing w:val="0"/>
+        </w:rPr>
+        <w:t xml:space="preserve">The grocery truck brings fresh produce on Fridays. (rb ×6)</w:t>
+      </w:r>
+    </w:p>
+    <w:p>
+      <w:pPr>
+        <w:ind w:left="720" w:first-line="-720"/>
+      </w:pPr>
+      <w:r>
+        <w:rPr>
+          <w:rFonts w:ascii="Helvetica" w:hAnsi="Helvetica" w:cs="Helvetica"/>
+          <w:sz w:val="24"/>
+          <w:sz-cs w:val="24"/>
+        </w:rPr>
+        <w:t xml:space="preserve"/>
+        <w:tab/>
+        <w:t xml:space="preserve">•</w:t>
+        <w:tab/>
+        <w:t xml:space="preserve"/>
+      </w:r>
+      <w:r>
+        <w:rPr>
+          <w:rFonts w:ascii="Helvetica" w:hAnsi="Helvetica" w:cs="Helvetica"/>
+          <w:sz w:val="24"/>
+          <w:sz-cs w:val="24"/>
+          <w:spacing w:val="0"/>
+        </w:rPr>
+        <w:t xml:space="preserve">I bought fresh bread and brown rice. (rb ×3)</w:t>
+      </w:r>
+    </w:p>
+    <w:p>
+      <w:pPr>
+        <w:ind w:left="720" w:first-line="-720"/>
+      </w:pPr>
+      <w:r>
+        <w:rPr>
+          <w:rFonts w:ascii="Helvetica" w:hAnsi="Helvetica" w:cs="Helvetica"/>
+          <w:sz w:val="24"/>
+          <w:sz-cs w:val="24"/>
+        </w:rPr>
+        <w:t xml:space="preserve"/>
+        <w:tab/>
+        <w:t xml:space="preserve">•</w:t>
+        <w:tab/>
+        <w:t xml:space="preserve"/>
+      </w:r>
+      <w:r>
+        <w:rPr>
+          <w:rFonts w:ascii="Helvetica" w:hAnsi="Helvetica" w:cs="Helvetica"/>
+          <w:sz w:val="24"/>
+          <w:sz-cs w:val="24"/>
+          <w:spacing w:val="0"/>
+        </w:rPr>
+        <w:t xml:space="preserve">The store stacks snacks near the checkout. (sb ×3)</w:t>
+      </w:r>
+    </w:p>
+    <w:p>
+      <w:pPr>
+        <w:ind w:left="720" w:first-line="-720"/>
+      </w:pPr>
+      <w:r>
+        <w:rPr>
+          <w:rFonts w:ascii="Helvetica" w:hAnsi="Helvetica" w:cs="Helvetica"/>
+          <w:sz w:val="24"/>
+          <w:sz-cs w:val="24"/>
+        </w:rPr>
+        <w:t xml:space="preserve"/>
+        <w:tab/>
+        <w:t xml:space="preserve">•</w:t>
+        <w:tab/>
+        <w:t xml:space="preserve"/>
+      </w:r>
+      <w:r>
+        <w:rPr>
+          <w:rFonts w:ascii="Helvetica" w:hAnsi="Helvetica" w:cs="Helvetica"/>
+          <w:sz w:val="24"/>
+          <w:sz-cs w:val="24"/>
+          <w:spacing w:val="0"/>
+        </w:rPr>
+        <w:t xml:space="preserve">I stopped at the store for steaks. (sb ×3)</w:t>
+      </w:r>
+    </w:p>
+    <w:p>
+      <w:pPr>
+        <w:ind w:left="720" w:first-line="-720"/>
+      </w:pPr>
+      <w:r>
+        <w:rPr>
+          <w:rFonts w:ascii="Helvetica" w:hAnsi="Helvetica" w:cs="Helvetica"/>
+          <w:sz w:val="24"/>
+          <w:sz-cs w:val="24"/>
+        </w:rPr>
+        <w:t xml:space="preserve"/>
+        <w:tab/>
+        <w:t xml:space="preserve">•</w:t>
+        <w:tab/>
+        <w:t xml:space="preserve"/>
+      </w:r>
+      <w:r>
+        <w:rPr>
+          <w:rFonts w:ascii="Helvetica" w:hAnsi="Helvetica" w:cs="Helvetica"/>
+          <w:sz w:val="24"/>
+          <w:sz-cs w:val="24"/>
+          <w:spacing w:val="0"/>
+        </w:rPr>
+        <w:t xml:space="preserve">Thank the clerk for gathering everything together. (th ×4)</w:t>
+      </w:r>
+    </w:p>
+    <w:p>
+      <w:pPr>
+        <w:ind w:left="720" w:first-line="-720"/>
+      </w:pPr>
+      <w:r>
+        <w:rPr>
+          <w:rFonts w:ascii="Helvetica" w:hAnsi="Helvetica" w:cs="Helvetica"/>
+          <w:sz w:val="24"/>
+          <w:sz-cs w:val="24"/>
+        </w:rPr>
+        <w:t xml:space="preserve"/>
+        <w:tab/>
+        <w:t xml:space="preserve">•</w:t>
+        <w:tab/>
+        <w:t xml:space="preserve"/>
+      </w:r>
+      <w:r>
+        <w:rPr>
+          <w:rFonts w:ascii="Helvetica" w:hAnsi="Helvetica" w:cs="Helvetica"/>
+          <w:sz w:val="24"/>
+          <w:sz-cs w:val="24"/>
+          <w:spacing w:val="0"/>
+        </w:rPr>
+        <w:t xml:space="preserve">I paid the exact amount with gift cards. (fc ×4)</w:t>
+      </w:r>
+    </w:p>
+    <w:p>
+      <w:pPr>
+        <w:ind w:left="720" w:first-line="-720"/>
+      </w:pPr>
+      <w:r>
+        <w:rPr>
+          <w:rFonts w:ascii="Helvetica" w:hAnsi="Helvetica" w:cs="Helvetica"/>
+          <w:sz w:val="24"/>
+          <w:sz-cs w:val="24"/>
+        </w:rPr>
+        <w:t xml:space="preserve"/>
+        <w:tab/>
+        <w:t xml:space="preserve">•</w:t>
+        <w:tab/>
+        <w:t xml:space="preserve"/>
+      </w:r>
+      <w:r>
+        <w:rPr>
+          <w:rFonts w:ascii="Helvetica" w:hAnsi="Helvetica" w:cs="Helvetica"/>
+          <w:sz w:val="24"/>
+          <w:sz-cs w:val="24"/>
+          <w:spacing w:val="0"/>
+        </w:rPr>
+        <w:t xml:space="preserve">The second receipt lists the correct amount. (fc ×5)</w:t>
+      </w:r>
+    </w:p>
+    <w:p>
+      <w:pPr>
+        <w:ind w:left="720" w:first-line="-720"/>
+      </w:pPr>
+      <w:r>
+        <w:rPr>
+          <w:rFonts w:ascii="Helvetica" w:hAnsi="Helvetica" w:cs="Helvetica"/>
+          <w:sz w:val="24"/>
+          <w:sz-cs w:val="24"/>
+        </w:rPr>
+        <w:t xml:space="preserve"/>
+        <w:tab/>
+        <w:t xml:space="preserve">•</w:t>
+        <w:tab/>
+        <w:t xml:space="preserve"/>
+      </w:r>
+      <w:r>
+        <w:rPr>
+          <w:rFonts w:ascii="Helvetica" w:hAnsi="Helvetica" w:cs="Helvetica"/>
+          <w:sz w:val="24"/>
+          <w:sz-cs w:val="24"/>
+          <w:spacing w:val="0"/>
+        </w:rPr>
+        <w:t xml:space="preserve">The stroller squeaked down the street. (tri ×3)</w:t>
+      </w:r>
+    </w:p>
+    <w:p>
+      <w:pPr>
+        <w:ind w:left="720" w:first-line="-720"/>
+      </w:pPr>
+      <w:r>
+        <w:rPr>
+          <w:rFonts w:ascii="Helvetica" w:hAnsi="Helvetica" w:cs="Helvetica"/>
+          <w:sz w:val="24"/>
+          <w:sz-cs w:val="24"/>
+        </w:rPr>
+        <w:t xml:space="preserve"/>
+        <w:tab/>
+        <w:t xml:space="preserve">•</w:t>
+        <w:tab/>
+        <w:t xml:space="preserve"/>
+      </w:r>
+      <w:r>
+        <w:rPr>
+          <w:rFonts w:ascii="Helvetica" w:hAnsi="Helvetica" w:cs="Helvetica"/>
+          <w:sz w:val="24"/>
+          <w:sz-cs w:val="24"/>
+          <w:spacing w:val="0"/>
+        </w:rPr>
+        <w:t xml:space="preserve">I grabbed strawberries, sprouts, and string cheese. (tri ×3)</w:t>
+      </w:r>
+    </w:p>
+    <w:p>
+      <w:pPr>
+        <w:ind w:left="720" w:first-line="-720"/>
+      </w:pPr>
+      <w:r>
+        <w:rPr>
+          <w:rFonts w:ascii="Helvetica" w:hAnsi="Helvetica" w:cs="Helvetica"/>
+          <w:sz w:val="24"/>
+          <w:sz-cs w:val="24"/>
+        </w:rPr>
+        <w:t xml:space="preserve"/>
+        <w:tab/>
+        <w:t xml:space="preserve">•</w:t>
+        <w:tab/>
+        <w:t xml:space="preserve"/>
+      </w:r>
+      <w:r>
+        <w:rPr>
+          <w:rFonts w:ascii="Helvetica" w:hAnsi="Helvetica" w:cs="Helvetica"/>
+          <w:sz w:val="24"/>
+          <w:sz-cs w:val="24"/>
+          <w:spacing w:val="0"/>
+        </w:rPr>
+        <w:t xml:space="preserve">The flower place sells blooming plants. (lb ×4)</w:t>
       </w:r>
     </w:p>
     <w:p>

</xml_diff>